<commit_message>
fix: engagement letter section numbering — dynamic sequential numbers
Sections 5 (Compilation), 6 (Div 7A), 7 (Trust Distributions), and
12 (Additional Terms) are conditional. When excluded, the output had
gaps in numbering (e.g. 1, 2, 3, 4, 8, 9, 10, 11, 13).

Added _engagement_section_numbers() method that computes sequential
section numbers based on which sections are active. Returns a dict
of section_X keys (e.g. section_scope=1, section_fees=2) that are
spread into the template context.

Template updated: all 13 hardcoded section numbers replaced with
{{ section_X }} variables. Conditional sections that are excluded
simply don't get a number assigned — the {% if %} block hides them
and remaining sections renumber consecutively.

After deploying, re-seed the template:
  python3 manage.py seed_engagement_letter_template \
    --file core/management/commands/Engagement_Letter_TEMPLATE_BW_v3.docx --force

Co-Authored-By: Claude Opus 4.6 (1M context) <noreply@anthropic.com>
</commit_message>
<xml_diff>
--- a/core/management/commands/Engagement_Letter_TEMPLATE_BW_v3.docx
+++ b/core/management/commands/Engagement_Letter_TEMPLATE_BW_v3.docx
@@ -557,7 +557,7 @@
           <w:sz w:val="20"/>
           <w:szCs w:val="20"/>
         </w:rPr>
-        <w:t xml:space="preserve">1. SCOPE OF SERVICES</w:t>
+        <w:t xml:space="preserve">{{ section_scope }}. SCOPE OF SERVICES</w:t>
       </w:r>
     </w:p>
     <w:p>
@@ -795,7 +795,7 @@
           <w:sz w:val="20"/>
           <w:szCs w:val="20"/>
         </w:rPr>
-        <w:t xml:space="preserve">2. OUR FEES</w:t>
+        <w:t xml:space="preserve">{{ section_fees }}. OUR FEES</w:t>
       </w:r>
     </w:p>
     <w:p>
@@ -1028,7 +1028,7 @@
           <w:sz w:val="20"/>
           <w:szCs w:val="20"/>
         </w:rPr>
-        <w:t xml:space="preserve">3. YOUR RESPONSIBILITIES</w:t>
+        <w:t xml:space="preserve">{{ section_client_resp }}. YOUR RESPONSIBILITIES</w:t>
       </w:r>
     </w:p>
     <w:p>
@@ -1197,7 +1197,7 @@
           <w:sz w:val="20"/>
           <w:szCs w:val="20"/>
         </w:rPr>
-        <w:t xml:space="preserve">4. OUR RESPONSIBILITIES</w:t>
+        <w:t xml:space="preserve">{{ section_firm_resp }}. OUR RESPONSIBILITIES</w:t>
       </w:r>
     </w:p>
     <w:p>
@@ -1339,7 +1339,7 @@
           <w:sz w:val="20"/>
           <w:szCs w:val="20"/>
         </w:rPr>
-        <w:t xml:space="preserve">5. COMPILATION ENGAGEMENT — SPECIFIC TERMS</w:t>
+        <w:t xml:space="preserve">{{ section_compilation }}. COMPILATION ENGAGEMENT — SPECIFIC TERMS</w:t>
       </w:r>
     </w:p>
     <w:p>
@@ -1524,7 +1524,7 @@
           <w:sz w:val="20"/>
           <w:szCs w:val="20"/>
         </w:rPr>
-        <w:t xml:space="preserve">6. DIVISION 7A — SPECIFIC TERMS</w:t>
+        <w:t xml:space="preserve">{{ section_div7a }}. DIVISION 7A — SPECIFIC TERMS</w:t>
       </w:r>
     </w:p>
     <w:p>
@@ -1633,7 +1633,7 @@
           <w:sz w:val="20"/>
           <w:szCs w:val="20"/>
         </w:rPr>
-        <w:t xml:space="preserve">7. TRUST DISTRIBUTIONS — SPECIFIC TERMS</w:t>
+        <w:t xml:space="preserve">{{ section_trust_dist }}. TRUST DISTRIBUTIONS — SPECIFIC TERMS</w:t>
       </w:r>
     </w:p>
     <w:p>
@@ -1708,7 +1708,7 @@
           <w:sz w:val="20"/>
           <w:szCs w:val="20"/>
         </w:rPr>
-        <w:t xml:space="preserve">8. PROFESSIONAL STANDARDS AND REGISTRATION</w:t>
+        <w:t xml:space="preserve">{{ section_standards }}. PROFESSIONAL STANDARDS AND REGISTRATION</w:t>
       </w:r>
     </w:p>
     <w:p>
@@ -1809,7 +1809,7 @@
           <w:sz w:val="20"/>
           <w:szCs w:val="20"/>
         </w:rPr>
-        <w:t xml:space="preserve">9. CONFIDENTIALITY, PRIVACY, AND DATA STORAGE</w:t>
+        <w:t xml:space="preserve">{{ section_privacy }}. CONFIDENTIALITY, PRIVACY, AND DATA STORAGE</w:t>
       </w:r>
     </w:p>
     <w:p>
@@ -2207,7 +2207,7 @@
           <w:sz w:val="20"/>
           <w:szCs w:val="20"/>
         </w:rPr>
-        <w:t xml:space="preserve">10. LIMITATION OF LIABILITY</w:t>
+        <w:t xml:space="preserve">{{ section_liability }}. LIMITATION OF LIABILITY</w:t>
       </w:r>
     </w:p>
     <w:p>
@@ -2268,7 +2268,7 @@
           <w:sz w:val="20"/>
           <w:szCs w:val="20"/>
         </w:rPr>
-        <w:t xml:space="preserve">11. DISPUTE RESOLUTION</w:t>
+        <w:t xml:space="preserve">{{ section_dispute }}. DISPUTE RESOLUTION</w:t>
       </w:r>
     </w:p>
     <w:p>
@@ -2349,7 +2349,7 @@
           <w:sz w:val="20"/>
           <w:szCs w:val="20"/>
         </w:rPr>
-        <w:t xml:space="preserve">12. ADDITIONAL TERMS</w:t>
+        <w:t xml:space="preserve">{{ section_additional }}. ADDITIONAL TERMS</w:t>
       </w:r>
     </w:p>
     <w:p>
@@ -2398,7 +2398,7 @@
           <w:sz w:val="20"/>
           <w:szCs w:val="20"/>
         </w:rPr>
-        <w:t xml:space="preserve">13. COMMENCEMENT</w:t>
+        <w:t xml:space="preserve">{{ section_commencement }}. COMMENCEMENT</w:t>
       </w:r>
     </w:p>
     <w:p>

</xml_diff>

<commit_message>
fix: engagement letter — BAS agent conditional + trust salutation fix
BAS Agent:
- Wrapped BAS agent registration sentence in {% if practice_bas_agent_number %}
  so it's hidden when the firm hasn't set a BAS agent number
- Removed default('N/A') fallback that was rendering "registration number N/A."
- FirmSettings.bas_agent_number field already exists — just needs populating

Trust Salutation:
- Removed redundant role == "trustee" check on the trustee dict that was
  failing for trustees whose primary role field was "director" (corporate
  trustees). The trustees list is already filtered by has_role("trustee")
  which checks the roles JSON array correctly.
- Now uses trustee's first name when any trustee officer exists

After deploying, re-seed the template:
  python3 manage.py seed_engagement_letter_template \
    --file core/management/commands/Engagement_Letter_TEMPLATE_BW_v3.docx --force

Co-Authored-By: Claude Opus 4.6 (1M context) <noreply@anthropic.com>
</commit_message>
<xml_diff>
--- a/core/management/commands/Engagement_Letter_TEMPLATE_BW_v3.docx
+++ b/core/management/commands/Engagement_Letter_TEMPLATE_BW_v3.docx
@@ -1770,27 +1770,27 @@
           <w:sz w:val="20"/>
           <w:szCs w:val="20"/>
         </w:rPr>
-        <w:t xml:space="preserve">Where applicable, we are registered as a BAS Agent with the Tax Practitioners Board, registration number </w:t>
-      </w:r>
-      <w:r>
-        <w:rPr>
-          <w:rFonts w:ascii="Courier New" w:cs="Courier New" w:eastAsia="Courier New" w:hAnsi="Courier New"/>
-          <w:b/>
-          <w:bCs/>
-          <w:color w:val="000000"/>
-          <w:sz w:val="20"/>
-          <w:szCs w:val="20"/>
-        </w:rPr>
-        <w:t xml:space="preserve">{{ practice_bas_agent_number | default('N/A') }}</w:t>
-      </w:r>
-      <w:r>
-        <w:rPr>
-          <w:rFonts w:ascii="Arial" w:cs="Arial" w:eastAsia="Arial" w:hAnsi="Arial"/>
-          <w:color w:val="000000"/>
-          <w:sz w:val="20"/>
-          <w:szCs w:val="20"/>
-        </w:rPr>
-        <w:t xml:space="preserve">.</w:t>
+        <w:t xml:space="preserve">{% if practice_bas_agent_number %}Where applicable, we are registered as a BAS Agent with the Tax Practitioners Board, registration number </w:t>
+      </w:r>
+      <w:r>
+        <w:rPr>
+          <w:rFonts w:ascii="Courier New" w:cs="Courier New" w:eastAsia="Courier New" w:hAnsi="Courier New"/>
+          <w:b/>
+          <w:bCs/>
+          <w:color w:val="000000"/>
+          <w:sz w:val="20"/>
+          <w:szCs w:val="20"/>
+        </w:rPr>
+        <w:t xml:space="preserve">{{ practice_bas_agent_number }}</w:t>
+      </w:r>
+      <w:r>
+        <w:rPr>
+          <w:rFonts w:ascii="Arial" w:cs="Arial" w:eastAsia="Arial" w:hAnsi="Arial"/>
+          <w:color w:val="000000"/>
+          <w:sz w:val="20"/>
+          <w:szCs w:val="20"/>
+        </w:rPr>
+        <w:t xml:space="preserve">.{% endif %}</w:t>
       </w:r>
     </w:p>
     <w:p>

</xml_diff>

<commit_message>
fix: engagement letter template — remove stray empty paragraphs, normalise spacing
Removed 11 zero-content spacer paragraphs from template XML that were
creating inconsistent vertical gaps between sections. Kept 13 structural
empty paragraphs in the signature block area (required for layout).

Updated section heading paragraphs to use consistent w:spacing values
(before=280, after=120) instead of relying on empty paragraph spacers
for vertical gaps between sections.

Template variable audit confirmed all template variables preserved:
selected_services, engagement_date, section_*, practice_bas_agent_number,
addressee_salutation, service.name, service.description, endfor.

After deploying, re-seed the template:
  python3 manage.py seed_engagement_letter_template \
    --file core/management/commands/Engagement_Letter_TEMPLATE_BW_v3.docx --force

Co-Authored-By: Claude Opus 4.6 (1M context) <noreply@anthropic.com>
</commit_message>
<xml_diff>
--- a/core/management/commands/Engagement_Letter_TEMPLATE_BW_v3.docx
+++ b/core/management/commands/Engagement_Letter_TEMPLATE_BW_v3.docx
@@ -1,6 +1,6 @@
 
 <file path=word/document.xml><?xml version="1.0" encoding="utf-8"?>
-<w:document xmlns:wpc="http://schemas.microsoft.com/office/word/2010/wordprocessingCanvas" xmlns:mc="http://schemas.openxmlformats.org/markup-compatibility/2006" xmlns:o="urn:schemas-microsoft-com:office:office" xmlns:r="http://schemas.openxmlformats.org/officeDocument/2006/relationships" xmlns:m="http://schemas.openxmlformats.org/officeDocument/2006/math" xmlns:v="urn:schemas-microsoft-com:vml" xmlns:wp14="http://schemas.microsoft.com/office/word/2010/wordprocessingDrawing" xmlns:wp="http://schemas.openxmlformats.org/drawingml/2006/wordprocessingDrawing" xmlns:w10="urn:schemas-microsoft-com:office:word" xmlns:w="http://schemas.openxmlformats.org/wordprocessingml/2006/main" xmlns:w14="http://schemas.microsoft.com/office/word/2010/wordml" xmlns:w15="http://schemas.microsoft.com/office/word/2012/wordml" xmlns:wpg="http://schemas.microsoft.com/office/word/2010/wordprocessingGroup" xmlns:wpi="http://schemas.microsoft.com/office/word/2010/wordprocessingInk" xmlns:wne="http://schemas.microsoft.com/office/word/2006/wordml" xmlns:wps="http://schemas.microsoft.com/office/word/2010/wordprocessingShape" xmlns:cx="http://schemas.microsoft.com/office/drawing/2014/chartex" xmlns:cx1="http://schemas.microsoft.com/office/drawing/2015/9/8/chartex" xmlns:cx2="http://schemas.microsoft.com/office/drawing/2015/10/21/chartex" xmlns:cx3="http://schemas.microsoft.com/office/drawing/2016/5/9/chartex" xmlns:cx4="http://schemas.microsoft.com/office/drawing/2016/5/10/chartex" xmlns:cx5="http://schemas.microsoft.com/office/drawing/2016/5/11/chartex" xmlns:cx6="http://schemas.microsoft.com/office/drawing/2016/5/12/chartex" xmlns:cx7="http://schemas.microsoft.com/office/drawing/2016/5/13/chartex" xmlns:cx8="http://schemas.microsoft.com/office/drawing/2016/5/14/chartex" xmlns:aink="http://schemas.microsoft.com/office/drawing/2016/ink" xmlns:am3d="http://schemas.microsoft.com/office/drawing/2017/model3d" xmlns:w16cex="http://schemas.microsoft.com/office/word/2018/wordml/cex" xmlns:w16cid="http://schemas.microsoft.com/office/word/2016/wordml/cid" xmlns:w16="http://schemas.microsoft.com/office/word/2018/wordml" xmlns:w16sdtdh="http://schemas.microsoft.com/office/word/2020/wordml/sdtdatahash" xmlns:w16se="http://schemas.microsoft.com/office/word/2015/wordml/symex" mc:Ignorable="w14 w15 wp14">
+<w:document xmlns:mc="http://schemas.openxmlformats.org/markup-compatibility/2006" xmlns:r="http://schemas.openxmlformats.org/officeDocument/2006/relationships" xmlns:w="http://schemas.openxmlformats.org/wordprocessingml/2006/main" mc:Ignorable="w14 w15 wp14">
   <w:body>
     <w:tbl>
       <w:tblPr>
@@ -185,17 +185,6 @@
     </w:tbl>
     <w:p>
       <w:pPr>
-        <w:pBdr>
-          <w:bottom w:val="single" w:color="999999" w:sz="4" w:space="1"/>
-        </w:pBdr>
-        <w:spacing w:before="140" w:after="140"/>
-      </w:pPr>
-      <w:r>
-        <w:t xml:space="preserve"/>
-      </w:r>
-    </w:p>
-    <w:p>
-      <w:pPr>
         <w:spacing w:before="0" w:after="0"/>
       </w:pPr>
       <w:r>
@@ -397,14 +386,6 @@
     </w:tbl>
     <w:p>
       <w:pPr>
-        <w:spacing w:before="0" w:after="0"/>
-      </w:pPr>
-      <w:r>
-        <w:t xml:space="preserve"/>
-      </w:r>
-    </w:p>
-    <w:p>
-      <w:pPr>
         <w:spacing w:before="120" w:after="120"/>
       </w:pPr>
       <w:r>
@@ -546,7 +527,7 @@
         <w:pBdr>
           <w:bottom w:val="single" w:color="000000" w:sz="6" w:space="3"/>
         </w:pBdr>
-        <w:spacing w:before="240" w:after="80"/>
+        <w:spacing w:before="280" w:after="120"/>
       </w:pPr>
       <w:r>
         <w:rPr>
@@ -572,14 +553,6 @@
           <w:szCs w:val="20"/>
         </w:rPr>
         <w:t xml:space="preserve">We have been engaged to provide the following services. Only those services marked below are included in this engagement:</w:t>
-      </w:r>
-    </w:p>
-    <w:p>
-      <w:pPr>
-        <w:spacing w:before="0" w:after="0"/>
-      </w:pPr>
-      <w:r>
-        <w:t xml:space="preserve"/>
       </w:r>
     </w:p>
     <w:tbl>
@@ -759,14 +732,6 @@
     </w:tbl>
     <w:p>
       <w:pPr>
-        <w:spacing w:before="0" w:after="0"/>
-      </w:pPr>
-      <w:r>
-        <w:t xml:space="preserve"/>
-      </w:r>
-    </w:p>
-    <w:p>
-      <w:pPr>
         <w:spacing w:before="120" w:after="120"/>
       </w:pPr>
       <w:r>
@@ -784,7 +749,7 @@
         <w:pBdr>
           <w:bottom w:val="single" w:color="000000" w:sz="6" w:space="3"/>
         </w:pBdr>
-        <w:spacing w:before="240" w:after="80"/>
+        <w:spacing w:before="280" w:after="120"/>
       </w:pPr>
       <w:r>
         <w:rPr>
@@ -1017,7 +982,7 @@
         <w:pBdr>
           <w:bottom w:val="single" w:color="000000" w:sz="6" w:space="3"/>
         </w:pBdr>
-        <w:spacing w:before="240" w:after="80"/>
+        <w:spacing w:before="280" w:after="120"/>
       </w:pPr>
       <w:r>
         <w:rPr>
@@ -1161,14 +1126,6 @@
     </w:p>
     <w:p>
       <w:pPr>
-        <w:spacing w:before="0" w:after="0"/>
-      </w:pPr>
-      <w:r>
-        <w:t xml:space="preserve"/>
-      </w:r>
-    </w:p>
-    <w:p>
-      <w:pPr>
         <w:spacing w:before="120" w:after="120"/>
       </w:pPr>
       <w:r>
@@ -1186,7 +1143,7 @@
         <w:pBdr>
           <w:bottom w:val="single" w:color="000000" w:sz="6" w:space="3"/>
         </w:pBdr>
-        <w:spacing w:before="240" w:after="80"/>
+        <w:spacing w:before="280" w:after="120"/>
       </w:pPr>
       <w:r>
         <w:rPr>
@@ -1328,7 +1285,7 @@
         <w:pBdr>
           <w:bottom w:val="single" w:color="000000" w:sz="6" w:space="3"/>
         </w:pBdr>
-        <w:spacing w:before="240" w:after="80"/>
+        <w:spacing w:before="280" w:after="120"/>
       </w:pPr>
       <w:r>
         <w:rPr>
@@ -1513,7 +1470,7 @@
         <w:pBdr>
           <w:bottom w:val="single" w:color="000000" w:sz="6" w:space="3"/>
         </w:pBdr>
-        <w:spacing w:before="240" w:after="80"/>
+        <w:spacing w:before="280" w:after="120"/>
       </w:pPr>
       <w:r>
         <w:rPr>
@@ -1615,6 +1572,835 @@
           <w:szCs w:val="16"/>
         </w:rPr>
         <w:t xml:space="preserve">{% if show_service_trust_distribution %}</w:t>
+      </w:r>
+    </w:p>
+    <w:p>
+      <w:pPr>
+        <w:pBdr>
+          <w:bottom w:val="single" w:color="000000" w:sz="6" w:space="3"/>
+        </w:pBdr>
+        <w:spacing w:before="280" w:after="120"/>
+      </w:pPr>
+      <w:r>
+        <w:rPr>
+          <w:rFonts w:ascii="Arial" w:cs="Arial" w:eastAsia="Arial" w:hAnsi="Arial"/>
+          <w:b/>
+          <w:bCs/>
+          <w:color w:val="000000"/>
+          <w:sz w:val="20"/>
+          <w:szCs w:val="20"/>
+        </w:rPr>
+        <w:t xml:space="preserve">{{ section_trust_dist }}. TRUST DISTRIBUTIONS — SPECIFIC TERMS</w:t>
+      </w:r>
+    </w:p>
+    <w:p>
+      <w:pPr>
+        <w:spacing w:before="120" w:after="120"/>
+      </w:pPr>
+      <w:r>
+        <w:rPr>
+          <w:rFonts w:ascii="Arial" w:cs="Arial" w:eastAsia="Arial" w:hAnsi="Arial"/>
+          <w:color w:val="000000"/>
+          <w:sz w:val="20"/>
+          <w:szCs w:val="20"/>
+        </w:rPr>
+        <w:t xml:space="preserve">For trust entities, trustee resolutions must be executed on or before 30 June each income year to be effective for that year. Failure to make a valid distribution resolution before this date may result in the ATO assessing the trustee on the entire net income of the trust at the top marginal tax rate.</w:t>
+      </w:r>
+    </w:p>
+    <w:p>
+      <w:pPr>
+        <w:spacing w:before="120" w:after="120"/>
+      </w:pPr>
+      <w:r>
+        <w:rPr>
+          <w:rFonts w:ascii="Arial" w:cs="Arial" w:eastAsia="Arial" w:hAnsi="Arial"/>
+          <w:color w:val="000000"/>
+          <w:sz w:val="20"/>
+          <w:szCs w:val="20"/>
+        </w:rPr>
+        <w:t xml:space="preserve">We will contact you prior to 30 June each year to obtain the information required to prepare the distribution resolution. It is your responsibility to respond promptly and to execute the resolution document before 30 June.</w:t>
+      </w:r>
+    </w:p>
+    <w:p>
+      <w:pPr>
+        <w:spacing w:before="120" w:after="120"/>
+      </w:pPr>
+      <w:r>
+        <w:rPr>
+          <w:rFonts w:ascii="Arial" w:cs="Arial" w:eastAsia="Arial" w:hAnsi="Arial"/>
+          <w:color w:val="000000"/>
+          <w:sz w:val="20"/>
+          <w:szCs w:val="20"/>
+        </w:rPr>
+        <w:t xml:space="preserve">We will also consider potential Section 100A risks in the context of trust distributions and advise you where we identify circumstances that may require further consideration.</w:t>
+      </w:r>
+    </w:p>
+    <w:p>
+      <w:pPr>
+        <w:spacing w:before="80" w:after="80"/>
+      </w:pPr>
+      <w:r>
+        <w:rPr>
+          <w:rFonts w:ascii="Courier New" w:cs="Courier New" w:eastAsia="Courier New" w:hAnsi="Courier New"/>
+          <w:color w:val="888888"/>
+          <w:sz w:val="16"/>
+          <w:szCs w:val="16"/>
+        </w:rPr>
+        <w:t xml:space="preserve">{% endif %}</w:t>
+      </w:r>
+    </w:p>
+    <w:p>
+      <w:pPr>
+        <w:pBdr>
+          <w:bottom w:val="single" w:color="000000" w:sz="6" w:space="3"/>
+        </w:pBdr>
+        <w:spacing w:before="280" w:after="120"/>
+      </w:pPr>
+      <w:r>
+        <w:rPr>
+          <w:rFonts w:ascii="Arial" w:cs="Arial" w:eastAsia="Arial" w:hAnsi="Arial"/>
+          <w:b/>
+          <w:bCs/>
+          <w:color w:val="000000"/>
+          <w:sz w:val="20"/>
+          <w:szCs w:val="20"/>
+        </w:rPr>
+        <w:t xml:space="preserve">{{ section_standards }}. PROFESSIONAL STANDARDS AND REGISTRATION</w:t>
+      </w:r>
+    </w:p>
+    <w:p>
+      <w:pPr>
+        <w:spacing w:before="120" w:after="120"/>
+      </w:pPr>
+      <w:r>
+        <w:rPr>
+          <w:rFonts w:ascii="Arial" w:cs="Arial" w:eastAsia="Arial" w:hAnsi="Arial"/>
+          <w:color w:val="000000"/>
+          <w:sz w:val="20"/>
+          <w:szCs w:val="20"/>
+        </w:rPr>
+        <w:t xml:space="preserve">{{ practice_name }} is a member of </w:t>
+      </w:r>
+      <w:r>
+        <w:rPr>
+          <w:rFonts w:ascii="Arial" w:cs="Arial" w:eastAsia="Arial" w:hAnsi="Arial"/>
+          <w:b/>
+          <w:bCs/>
+          <w:color w:val="000000"/>
+          <w:sz w:val="20"/>
+          <w:szCs w:val="20"/>
+        </w:rPr>
+        <w:t xml:space="preserve">{{ practice_professional_body }}</w:t>
+      </w:r>
+      <w:r>
+        <w:rPr>
+          <w:rFonts w:ascii="Arial" w:cs="Arial" w:eastAsia="Arial" w:hAnsi="Arial"/>
+          <w:color w:val="000000"/>
+          <w:sz w:val="20"/>
+          <w:szCs w:val="20"/>
+        </w:rPr>
+        <w:t xml:space="preserve"> and is bound by its professional standards, code of ethics, and continuing professional development requirements. All professional services are performed in accordance with these standards.</w:t>
+      </w:r>
+    </w:p>
+    <w:p>
+      <w:pPr>
+        <w:spacing w:before="120" w:after="120"/>
+      </w:pPr>
+      <w:r>
+        <w:rPr>
+          <w:rFonts w:ascii="Arial" w:cs="Arial" w:eastAsia="Arial" w:hAnsi="Arial"/>
+          <w:color w:val="000000"/>
+          <w:sz w:val="20"/>
+          <w:szCs w:val="20"/>
+        </w:rPr>
+        <w:t xml:space="preserve">{{ tpb_registration_statement }}</w:t>
+      </w:r>
+    </w:p>
+    <w:p>
+      <w:pPr>
+        <w:spacing w:before="120" w:after="120"/>
+      </w:pPr>
+      <w:r>
+        <w:rPr>
+          <w:rFonts w:ascii="Arial" w:cs="Arial" w:eastAsia="Arial" w:hAnsi="Arial"/>
+          <w:color w:val="000000"/>
+          <w:sz w:val="20"/>
+          <w:szCs w:val="20"/>
+        </w:rPr>
+        <w:t xml:space="preserve">{% if practice_bas_agent_number %}Where applicable, we are registered as a BAS Agent with the Tax Practitioners Board, registration number </w:t>
+      </w:r>
+      <w:r>
+        <w:rPr>
+          <w:rFonts w:ascii="Courier New" w:cs="Courier New" w:eastAsia="Courier New" w:hAnsi="Courier New"/>
+          <w:b/>
+          <w:bCs/>
+          <w:color w:val="000000"/>
+          <w:sz w:val="20"/>
+          <w:szCs w:val="20"/>
+        </w:rPr>
+        <w:t xml:space="preserve">{{ practice_bas_agent_number }}</w:t>
+      </w:r>
+      <w:r>
+        <w:rPr>
+          <w:rFonts w:ascii="Arial" w:cs="Arial" w:eastAsia="Arial" w:hAnsi="Arial"/>
+          <w:color w:val="000000"/>
+          <w:sz w:val="20"/>
+          <w:szCs w:val="20"/>
+        </w:rPr>
+        <w:t xml:space="preserve">.{% endif %}</w:t>
+      </w:r>
+    </w:p>
+    <w:p>
+      <w:pPr>
+        <w:pBdr>
+          <w:bottom w:val="single" w:color="000000" w:sz="6" w:space="3"/>
+        </w:pBdr>
+        <w:spacing w:before="280" w:after="120"/>
+      </w:pPr>
+      <w:r>
+        <w:rPr>
+          <w:rFonts w:ascii="Arial" w:cs="Arial" w:eastAsia="Arial" w:hAnsi="Arial"/>
+          <w:b/>
+          <w:bCs/>
+          <w:color w:val="000000"/>
+          <w:sz w:val="20"/>
+          <w:szCs w:val="20"/>
+        </w:rPr>
+        <w:t xml:space="preserve">{{ section_privacy }}. CONFIDENTIALITY, PRIVACY, AND DATA STORAGE</w:t>
+      </w:r>
+    </w:p>
+    <w:p>
+      <w:pPr>
+        <w:spacing w:before="120" w:after="120"/>
+      </w:pPr>
+      <w:r>
+        <w:rPr>
+          <w:rFonts w:ascii="Arial" w:cs="Arial" w:eastAsia="Arial" w:hAnsi="Arial"/>
+          <w:color w:val="000000"/>
+          <w:sz w:val="20"/>
+          <w:szCs w:val="20"/>
+        </w:rPr>
+        <w:t xml:space="preserve">We handle your personal and financial information in accordance with the </w:t>
+      </w:r>
+      <w:r>
+        <w:rPr>
+          <w:rFonts w:ascii="Arial" w:cs="Arial" w:eastAsia="Arial" w:hAnsi="Arial"/>
+          <w:b/>
+          <w:bCs/>
+          <w:color w:val="000000"/>
+          <w:sz w:val="20"/>
+          <w:szCs w:val="20"/>
+        </w:rPr>
+        <w:t xml:space="preserve">Privacy Act 1988 (Cth)</w:t>
+      </w:r>
+      <w:r>
+        <w:rPr>
+          <w:rFonts w:ascii="Arial" w:cs="Arial" w:eastAsia="Arial" w:hAnsi="Arial"/>
+          <w:color w:val="000000"/>
+          <w:sz w:val="20"/>
+          <w:szCs w:val="20"/>
+        </w:rPr>
+        <w:t xml:space="preserve"> and the Australian Privacy Principles (APPs). Our full Privacy Policy is available at </w:t>
+      </w:r>
+      <w:r>
+        <w:rPr>
+          <w:rFonts w:ascii="Courier New" w:cs="Courier New" w:eastAsia="Courier New" w:hAnsi="Courier New"/>
+          <w:b/>
+          <w:bCs/>
+          <w:color w:val="000000"/>
+          <w:sz w:val="20"/>
+          <w:szCs w:val="20"/>
+        </w:rPr>
+        <w:t xml:space="preserve">{{ practice_website }}</w:t>
+      </w:r>
+      <w:r>
+        <w:rPr>
+          <w:rFonts w:ascii="Arial" w:cs="Arial" w:eastAsia="Arial" w:hAnsi="Arial"/>
+          <w:color w:val="000000"/>
+          <w:sz w:val="20"/>
+          <w:szCs w:val="20"/>
+        </w:rPr>
+        <w:t xml:space="preserve">. By engaging us, you consent to the collection, use, and storage of your information as described in this section.</w:t>
+      </w:r>
+    </w:p>
+    <w:p>
+      <w:pPr>
+        <w:spacing w:before="120" w:after="120"/>
+      </w:pPr>
+      <w:r>
+        <w:rPr>
+          <w:rFonts w:ascii="Arial" w:cs="Arial" w:eastAsia="Arial" w:hAnsi="Arial"/>
+          <w:b/>
+          <w:bCs/>
+          <w:color w:val="000000"/>
+          <w:sz w:val="20"/>
+          <w:szCs w:val="20"/>
+        </w:rPr>
+        <w:t xml:space="preserve">Cloud-Based Practice Software.  </w:t>
+      </w:r>
+      <w:r>
+        <w:rPr>
+          <w:rFonts w:ascii="Arial" w:cs="Arial" w:eastAsia="Arial" w:hAnsi="Arial"/>
+          <w:color w:val="000000"/>
+          <w:sz w:val="20"/>
+          <w:szCs w:val="20"/>
+        </w:rPr>
+        <w:t xml:space="preserve">We use cloud-based practice management software to prepare, store, and manage your financial records, documents, correspondence, and tax data. This software is hosted on servers located in Australia. Your data is not sold, shared with third parties for commercial purposes, or used for any purpose other than providing the services described in this letter.</w:t>
+      </w:r>
+    </w:p>
+    <w:p>
+      <w:pPr>
+        <w:spacing w:before="120" w:after="120"/>
+      </w:pPr>
+      <w:r>
+        <w:rPr>
+          <w:rFonts w:ascii="Arial" w:cs="Arial" w:eastAsia="Arial" w:hAnsi="Arial"/>
+          <w:b/>
+          <w:bCs/>
+          <w:color w:val="000000"/>
+          <w:sz w:val="20"/>
+          <w:szCs w:val="20"/>
+        </w:rPr>
+        <w:t xml:space="preserve">Third-Party Service Providers.  </w:t>
+      </w:r>
+      <w:r>
+        <w:rPr>
+          <w:rFonts w:ascii="Arial" w:cs="Arial" w:eastAsia="Arial" w:hAnsi="Arial"/>
+          <w:color w:val="000000"/>
+          <w:sz w:val="20"/>
+          <w:szCs w:val="20"/>
+        </w:rPr>
+        <w:t xml:space="preserve">Where we engage third-party service providers to assist in delivering our services — including document signing platforms, accounting software integrations, and cloud infrastructure providers — those providers are bound by confidentiality obligations consistent with the Privacy Act 1988 (Cth). We will not share your information with third parties beyond what is strictly necessary to carry out your instructions.</w:t>
+      </w:r>
+    </w:p>
+    <w:p>
+      <w:pPr>
+        <w:spacing w:before="120" w:after="120"/>
+      </w:pPr>
+      <w:r>
+        <w:rPr>
+          <w:rFonts w:ascii="Arial" w:cs="Arial" w:eastAsia="Arial" w:hAnsi="Arial"/>
+          <w:b/>
+          <w:bCs/>
+          <w:color w:val="000000"/>
+          <w:sz w:val="20"/>
+          <w:szCs w:val="20"/>
+        </w:rPr>
+        <w:t xml:space="preserve">Regulatory Disclosure.  </w:t>
+      </w:r>
+      <w:r>
+        <w:rPr>
+          <w:rFonts w:ascii="Arial" w:cs="Arial" w:eastAsia="Arial" w:hAnsi="Arial"/>
+          <w:color w:val="000000"/>
+          <w:sz w:val="20"/>
+          <w:szCs w:val="20"/>
+        </w:rPr>
+        <w:t xml:space="preserve">We will disclose your information to the Australian Taxation Office, ASIC, state revenue authorities, and other regulatory bodies only where required by law or where necessary to carry out your instructions, such as lodging returns and statements on your behalf.</w:t>
+      </w:r>
+    </w:p>
+    <w:p>
+      <w:pPr>
+        <w:spacing w:before="80" w:after="80"/>
+      </w:pPr>
+      <w:r>
+        <w:rPr>
+          <w:rFonts w:ascii="Courier New" w:cs="Courier New" w:eastAsia="Courier New" w:hAnsi="Courier New"/>
+          <w:color w:val="888888"/>
+          <w:sz w:val="16"/>
+          <w:szCs w:val="16"/>
+        </w:rPr>
+        <w:t xml:space="preserve">{% if show_client_portal %}</w:t>
+      </w:r>
+    </w:p>
+    <w:p>
+      <w:pPr>
+        <w:spacing w:before="120" w:after="120"/>
+      </w:pPr>
+      <w:r>
+        <w:rPr>
+          <w:rFonts w:ascii="Arial" w:cs="Arial" w:eastAsia="Arial" w:hAnsi="Arial"/>
+          <w:b/>
+          <w:bCs/>
+          <w:color w:val="000000"/>
+          <w:sz w:val="20"/>
+          <w:szCs w:val="20"/>
+        </w:rPr>
+        <w:t xml:space="preserve">Client Portal.  </w:t>
+      </w:r>
+      <w:r>
+        <w:rPr>
+          <w:rFonts w:ascii="Arial" w:cs="Arial" w:eastAsia="Arial" w:hAnsi="Arial"/>
+          <w:color w:val="000000"/>
+          <w:sz w:val="20"/>
+          <w:szCs w:val="20"/>
+        </w:rPr>
+        <w:t xml:space="preserve">We provide access to a secure client portal at </w:t>
+      </w:r>
+      <w:r>
+        <w:rPr>
+          <w:rFonts w:ascii="Courier New" w:cs="Courier New" w:eastAsia="Courier New" w:hAnsi="Courier New"/>
+          <w:b/>
+          <w:bCs/>
+          <w:color w:val="000000"/>
+          <w:sz w:val="20"/>
+          <w:szCs w:val="20"/>
+        </w:rPr>
+        <w:t xml:space="preserve">{{ client_portal_url }}</w:t>
+      </w:r>
+      <w:r>
+        <w:rPr>
+          <w:rFonts w:ascii="Arial" w:cs="Arial" w:eastAsia="Arial" w:hAnsi="Arial"/>
+          <w:color w:val="000000"/>
+          <w:sz w:val="20"/>
+          <w:szCs w:val="20"/>
+        </w:rPr>
+        <w:t xml:space="preserve">. The portal allows you to view documents, approve financial statements, and communicate with our team securely. By accessing the portal, you accept the applicable terms of service for that platform. Access credentials will be provided to you separately.</w:t>
+      </w:r>
+    </w:p>
+    <w:p>
+      <w:pPr>
+        <w:spacing w:before="80" w:after="80"/>
+      </w:pPr>
+      <w:r>
+        <w:rPr>
+          <w:rFonts w:ascii="Courier New" w:cs="Courier New" w:eastAsia="Courier New" w:hAnsi="Courier New"/>
+          <w:color w:val="888888"/>
+          <w:sz w:val="16"/>
+          <w:szCs w:val="16"/>
+        </w:rPr>
+        <w:t xml:space="preserve">{% endif %}</w:t>
+      </w:r>
+    </w:p>
+    <w:p>
+      <w:pPr>
+        <w:spacing w:before="80" w:after="80"/>
+      </w:pPr>
+      <w:r>
+        <w:rPr>
+          <w:rFonts w:ascii="Courier New" w:cs="Courier New" w:eastAsia="Courier New" w:hAnsi="Courier New"/>
+          <w:color w:val="888888"/>
+          <w:sz w:val="16"/>
+          <w:szCs w:val="16"/>
+        </w:rPr>
+        <w:t xml:space="preserve">{% if show_fusesign %}</w:t>
+      </w:r>
+    </w:p>
+    <w:p>
+      <w:pPr>
+        <w:spacing w:before="120" w:after="120"/>
+      </w:pPr>
+      <w:r>
+        <w:rPr>
+          <w:rFonts w:ascii="Arial" w:cs="Arial" w:eastAsia="Arial" w:hAnsi="Arial"/>
+          <w:b/>
+          <w:bCs/>
+          <w:color w:val="000000"/>
+          <w:sz w:val="20"/>
+          <w:szCs w:val="20"/>
+        </w:rPr>
+        <w:t xml:space="preserve">Electronic Document Signing.  </w:t>
+      </w:r>
+      <w:r>
+        <w:rPr>
+          <w:rFonts w:ascii="Arial" w:cs="Arial" w:eastAsia="Arial" w:hAnsi="Arial"/>
+          <w:color w:val="000000"/>
+          <w:sz w:val="20"/>
+          <w:szCs w:val="20"/>
+        </w:rPr>
+        <w:t xml:space="preserve">We use an electronic document signing platform to send documents to you for execution. This platform processes your name, email address, and electronic signature for the sole purpose of executing documents relating to your engagement with us. By signing documents electronically, you accept the applicable terms of that platform. Electronic signatures applied through this service are legally binding under the </w:t>
+      </w:r>
+      <w:r>
+        <w:rPr>
+          <w:rFonts w:ascii="Arial" w:cs="Arial" w:eastAsia="Arial" w:hAnsi="Arial"/>
+          <w:b/>
+          <w:bCs/>
+          <w:color w:val="000000"/>
+          <w:sz w:val="20"/>
+          <w:szCs w:val="20"/>
+        </w:rPr>
+        <w:t xml:space="preserve">Electronic Transactions Act 1999 (Cth)</w:t>
+      </w:r>
+      <w:r>
+        <w:rPr>
+          <w:rFonts w:ascii="Arial" w:cs="Arial" w:eastAsia="Arial" w:hAnsi="Arial"/>
+          <w:color w:val="000000"/>
+          <w:sz w:val="20"/>
+          <w:szCs w:val="20"/>
+        </w:rPr>
+        <w:t xml:space="preserve">.</w:t>
+      </w:r>
+    </w:p>
+    <w:p>
+      <w:pPr>
+        <w:spacing w:before="80" w:after="80"/>
+      </w:pPr>
+      <w:r>
+        <w:rPr>
+          <w:rFonts w:ascii="Courier New" w:cs="Courier New" w:eastAsia="Courier New" w:hAnsi="Courier New"/>
+          <w:color w:val="888888"/>
+          <w:sz w:val="16"/>
+          <w:szCs w:val="16"/>
+        </w:rPr>
+        <w:t xml:space="preserve">{% endif %}</w:t>
+      </w:r>
+    </w:p>
+    <w:p>
+      <w:pPr>
+        <w:spacing w:before="120" w:after="120"/>
+      </w:pPr>
+      <w:r>
+        <w:rPr>
+          <w:rFonts w:ascii="Arial" w:cs="Arial" w:eastAsia="Arial" w:hAnsi="Arial"/>
+          <w:b/>
+          <w:bCs/>
+          <w:color w:val="000000"/>
+          <w:sz w:val="20"/>
+          <w:szCs w:val="20"/>
+        </w:rPr>
+        <w:t xml:space="preserve">Data Retention.  </w:t>
+      </w:r>
+      <w:r>
+        <w:rPr>
+          <w:rFonts w:ascii="Arial" w:cs="Arial" w:eastAsia="Arial" w:hAnsi="Arial"/>
+          <w:color w:val="000000"/>
+          <w:sz w:val="20"/>
+          <w:szCs w:val="20"/>
+        </w:rPr>
+        <w:t xml:space="preserve">We retain your financial records and documents for a minimum of seven years from the date of the relevant return, document, or transaction, in accordance with ATO record-keeping requirements and our obligations under the </w:t>
+      </w:r>
+      <w:r>
+        <w:rPr>
+          <w:rFonts w:ascii="Arial" w:cs="Arial" w:eastAsia="Arial" w:hAnsi="Arial"/>
+          <w:b/>
+          <w:bCs/>
+          <w:color w:val="000000"/>
+          <w:sz w:val="20"/>
+          <w:szCs w:val="20"/>
+        </w:rPr>
+        <w:t xml:space="preserve">Tax Agent Services Act 2009</w:t>
+      </w:r>
+      <w:r>
+        <w:rPr>
+          <w:rFonts w:ascii="Arial" w:cs="Arial" w:eastAsia="Arial" w:hAnsi="Arial"/>
+          <w:color w:val="000000"/>
+          <w:sz w:val="20"/>
+          <w:szCs w:val="20"/>
+        </w:rPr>
+        <w:t xml:space="preserve">. After this period, records may be securely destroyed unless you notify us in writing prior to that time that you wish to retain them.</w:t>
+      </w:r>
+    </w:p>
+    <w:p>
+      <w:pPr>
+        <w:spacing w:before="120" w:after="120"/>
+      </w:pPr>
+      <w:r>
+        <w:rPr>
+          <w:rFonts w:ascii="Arial" w:cs="Arial" w:eastAsia="Arial" w:hAnsi="Arial"/>
+          <w:b/>
+          <w:bCs/>
+          <w:color w:val="000000"/>
+          <w:sz w:val="20"/>
+          <w:szCs w:val="20"/>
+        </w:rPr>
+        <w:t xml:space="preserve">Access and Correction.  </w:t>
+      </w:r>
+      <w:r>
+        <w:rPr>
+          <w:rFonts w:ascii="Arial" w:cs="Arial" w:eastAsia="Arial" w:hAnsi="Arial"/>
+          <w:color w:val="000000"/>
+          <w:sz w:val="20"/>
+          <w:szCs w:val="20"/>
+        </w:rPr>
+        <w:t xml:space="preserve">You have the right to access the personal information we hold about you and to request corrections where that information is inaccurate, incomplete, or out of date. To make a request, contact us at </w:t>
+      </w:r>
+      <w:r>
+        <w:rPr>
+          <w:rFonts w:ascii="Courier New" w:cs="Courier New" w:eastAsia="Courier New" w:hAnsi="Courier New"/>
+          <w:b/>
+          <w:bCs/>
+          <w:color w:val="000000"/>
+          <w:sz w:val="20"/>
+          <w:szCs w:val="20"/>
+        </w:rPr>
+        <w:t xml:space="preserve">{{ practice_email }}</w:t>
+      </w:r>
+      <w:r>
+        <w:rPr>
+          <w:rFonts w:ascii="Arial" w:cs="Arial" w:eastAsia="Arial" w:hAnsi="Arial"/>
+          <w:color w:val="000000"/>
+          <w:sz w:val="20"/>
+          <w:szCs w:val="20"/>
+        </w:rPr>
+        <w:t xml:space="preserve">. We will respond within 30 days.</w:t>
+      </w:r>
+    </w:p>
+    <w:p>
+      <w:pPr>
+        <w:spacing w:before="120" w:after="120"/>
+      </w:pPr>
+      <w:r>
+        <w:rPr>
+          <w:rFonts w:ascii="Arial" w:cs="Arial" w:eastAsia="Arial" w:hAnsi="Arial"/>
+          <w:color w:val="000000"/>
+          <w:sz w:val="20"/>
+          <w:szCs w:val="20"/>
+        </w:rPr>
+        <w:t xml:space="preserve">If you do not wish us to use your information in a particular way, please advise us in writing. We will consider your request, noting that in some cases this may affect our ability to provide the services described in this letter.</w:t>
+      </w:r>
+    </w:p>
+    <w:p>
+      <w:pPr>
+        <w:pBdr>
+          <w:bottom w:val="single" w:color="000000" w:sz="6" w:space="3"/>
+        </w:pBdr>
+        <w:spacing w:before="280" w:after="120"/>
+      </w:pPr>
+      <w:r>
+        <w:rPr>
+          <w:rFonts w:ascii="Arial" w:cs="Arial" w:eastAsia="Arial" w:hAnsi="Arial"/>
+          <w:b/>
+          <w:bCs/>
+          <w:color w:val="000000"/>
+          <w:sz w:val="20"/>
+          <w:szCs w:val="20"/>
+        </w:rPr>
+        <w:t xml:space="preserve">{{ section_liability }}. LIMITATION OF LIABILITY</w:t>
+      </w:r>
+    </w:p>
+    <w:p>
+      <w:pPr>
+        <w:spacing w:before="120" w:after="120"/>
+      </w:pPr>
+      <w:r>
+        <w:rPr>
+          <w:rFonts w:ascii="Arial" w:cs="Arial" w:eastAsia="Arial" w:hAnsi="Arial"/>
+          <w:color w:val="000000"/>
+          <w:sz w:val="20"/>
+          <w:szCs w:val="20"/>
+        </w:rPr>
+        <w:t xml:space="preserve">Our liability to you arising out of or in connection with this engagement is limited to the fees paid by you to us for the specific services giving rise to the liability, or to the extent permitted by law, the maximum amount our professional indemnity insurance will cover in respect of that claim.</w:t>
+      </w:r>
+    </w:p>
+    <w:p>
+      <w:pPr>
+        <w:spacing w:before="120" w:after="120"/>
+      </w:pPr>
+      <w:r>
+        <w:rPr>
+          <w:rFonts w:ascii="Arial" w:cs="Arial" w:eastAsia="Arial" w:hAnsi="Arial"/>
+          <w:color w:val="000000"/>
+          <w:sz w:val="20"/>
+          <w:szCs w:val="20"/>
+        </w:rPr>
+        <w:t xml:space="preserve">We are not liable for any loss, damage, or expense arising from our reliance on information provided by you that was incomplete, inaccurate, or misleading. We are not liable for any indirect, consequential, special, or incidental loss or damage.</w:t>
+      </w:r>
+    </w:p>
+    <w:p>
+      <w:pPr>
+        <w:spacing w:before="120" w:after="120"/>
+      </w:pPr>
+      <w:r>
+        <w:rPr>
+          <w:rFonts w:ascii="Arial" w:cs="Arial" w:eastAsia="Arial" w:hAnsi="Arial"/>
+          <w:color w:val="000000"/>
+          <w:sz w:val="20"/>
+          <w:szCs w:val="20"/>
+        </w:rPr>
+        <w:t xml:space="preserve">Nothing in this clause limits our liability for fraud, wilful misconduct, or any liability that cannot be excluded by law.</w:t>
+      </w:r>
+    </w:p>
+    <w:p>
+      <w:pPr>
+        <w:pBdr>
+          <w:bottom w:val="single" w:color="000000" w:sz="6" w:space="3"/>
+        </w:pBdr>
+        <w:spacing w:before="280" w:after="120"/>
+      </w:pPr>
+      <w:r>
+        <w:rPr>
+          <w:rFonts w:ascii="Arial" w:cs="Arial" w:eastAsia="Arial" w:hAnsi="Arial"/>
+          <w:b/>
+          <w:bCs/>
+          <w:color w:val="000000"/>
+          <w:sz w:val="20"/>
+          <w:szCs w:val="20"/>
+        </w:rPr>
+        <w:t xml:space="preserve">{{ section_dispute }}. DISPUTE RESOLUTION</w:t>
+      </w:r>
+    </w:p>
+    <w:p>
+      <w:pPr>
+        <w:spacing w:before="120" w:after="120"/>
+      </w:pPr>
+      <w:r>
+        <w:rPr>
+          <w:rFonts w:ascii="Arial" w:cs="Arial" w:eastAsia="Arial" w:hAnsi="Arial"/>
+          <w:color w:val="000000"/>
+          <w:sz w:val="20"/>
+          <w:szCs w:val="20"/>
+        </w:rPr>
+        <w:t xml:space="preserve">If a dispute arises from this engagement, we ask that you first raise the matter directly with the partner responsible for your engagement so that we may attempt to resolve it. If we are unable to resolve the dispute, either party may refer the matter to the complaints process of </w:t>
+      </w:r>
+      <w:r>
+        <w:rPr>
+          <w:rFonts w:ascii="Arial" w:cs="Arial" w:eastAsia="Arial" w:hAnsi="Arial"/>
+          <w:b/>
+          <w:bCs/>
+          <w:color w:val="000000"/>
+          <w:sz w:val="20"/>
+          <w:szCs w:val="20"/>
+        </w:rPr>
+        <w:t xml:space="preserve">{{ practice_professional_body }}</w:t>
+      </w:r>
+      <w:r>
+        <w:rPr>
+          <w:rFonts w:ascii="Arial" w:cs="Arial" w:eastAsia="Arial" w:hAnsi="Arial"/>
+          <w:color w:val="000000"/>
+          <w:sz w:val="20"/>
+          <w:szCs w:val="20"/>
+        </w:rPr>
+        <w:t xml:space="preserve"> in accordance with their dispute resolution procedures.</w:t>
+      </w:r>
+    </w:p>
+    <w:p>
+      <w:pPr>
+        <w:spacing w:before="120" w:after="120"/>
+      </w:pPr>
+      <w:r>
+        <w:rPr>
+          <w:rFonts w:ascii="Arial" w:cs="Arial" w:eastAsia="Arial" w:hAnsi="Arial"/>
+          <w:color w:val="000000"/>
+          <w:sz w:val="20"/>
+          <w:szCs w:val="20"/>
+        </w:rPr>
+        <w:t xml:space="preserve">This engagement is governed by the laws of Victoria, Australia.</w:t>
+      </w:r>
+    </w:p>
+    <w:p>
+      <w:pPr>
+        <w:spacing w:before="80" w:after="80"/>
+      </w:pPr>
+      <w:r>
+        <w:rPr>
+          <w:rFonts w:ascii="Courier New" w:cs="Courier New" w:eastAsia="Courier New" w:hAnsi="Courier New"/>
+          <w:color w:val="888888"/>
+          <w:sz w:val="16"/>
+          <w:szCs w:val="16"/>
+        </w:rPr>
+        <w:t xml:space="preserve">{% if show_additional_terms %}</w:t>
+      </w:r>
+    </w:p>
+    <w:p>
+      <w:pPr>
+        <w:pBdr>
+          <w:bottom w:val="single" w:color="000000" w:sz="6" w:space="3"/>
+        </w:pBdr>
+        <w:spacing w:before="280" w:after="120"/>
+      </w:pPr>
+      <w:r>
+        <w:rPr>
+          <w:rFonts w:ascii="Arial" w:cs="Arial" w:eastAsia="Arial" w:hAnsi="Arial"/>
+          <w:b/>
+          <w:bCs/>
+          <w:color w:val="000000"/>
+          <w:sz w:val="20"/>
+          <w:szCs w:val="20"/>
+        </w:rPr>
+        <w:t xml:space="preserve">{{ section_additional }}. ADDITIONAL TERMS</w:t>
+      </w:r>
+    </w:p>
+    <w:p>
+      <w:pPr>
+        <w:spacing w:before="120" w:after="120"/>
+      </w:pPr>
+      <w:r>
+        <w:rPr>
+          <w:rFonts w:ascii="Courier New" w:cs="Courier New" w:eastAsia="Courier New" w:hAnsi="Courier New"/>
+          <w:b/>
+          <w:bCs/>
+          <w:color w:val="000000"/>
+          <w:sz w:val="20"/>
+          <w:szCs w:val="20"/>
+        </w:rPr>
+        <w:t xml:space="preserve">{{ additional_terms }}</w:t>
+      </w:r>
+    </w:p>
+    <w:p>
+      <w:pPr>
+        <w:spacing w:before="80" w:after="80"/>
+      </w:pPr>
+      <w:r>
+        <w:rPr>
+          <w:rFonts w:ascii="Courier New" w:cs="Courier New" w:eastAsia="Courier New" w:hAnsi="Courier New"/>
+          <w:color w:val="888888"/>
+          <w:sz w:val="16"/>
+          <w:szCs w:val="16"/>
+        </w:rPr>
+        <w:t xml:space="preserve">{% endif %}</w:t>
+      </w:r>
+    </w:p>
+    <w:p>
+      <w:pPr>
+        <w:pBdr>
+          <w:bottom w:val="single" w:color="000000" w:sz="6" w:space="3"/>
+        </w:pBdr>
+        <w:spacing w:before="280" w:after="120"/>
+      </w:pPr>
+      <w:r>
+        <w:rPr>
+          <w:rFonts w:ascii="Arial" w:cs="Arial" w:eastAsia="Arial" w:hAnsi="Arial"/>
+          <w:b/>
+          <w:bCs/>
+          <w:color w:val="000000"/>
+          <w:sz w:val="20"/>
+          <w:szCs w:val="20"/>
+        </w:rPr>
+        <w:t xml:space="preserve">{{ section_commencement }}. COMMENCEMENT</w:t>
+      </w:r>
+    </w:p>
+    <w:p>
+      <w:pPr>
+        <w:spacing w:before="120" w:after="120"/>
+      </w:pPr>
+      <w:r>
+        <w:rPr>
+          <w:rFonts w:ascii="Arial" w:cs="Arial" w:eastAsia="Arial" w:hAnsi="Arial"/>
+          <w:color w:val="000000"/>
+          <w:sz w:val="20"/>
+          <w:szCs w:val="20"/>
+        </w:rPr>
+        <w:t xml:space="preserve">This engagement letter takes effect from the date of acceptance below and continues until terminated by either party in writing, or until superseded by a new engagement letter.</w:t>
+      </w:r>
+    </w:p>
+    <w:p>
+      <w:pPr>
+        <w:spacing w:before="120" w:after="120"/>
+      </w:pPr>
+      <w:r>
+        <w:rPr>
+          <w:rFonts w:ascii="Arial" w:cs="Arial" w:eastAsia="Arial" w:hAnsi="Arial"/>
+          <w:color w:val="000000"/>
+          <w:sz w:val="20"/>
+          <w:szCs w:val="20"/>
+        </w:rPr>
+        <w:t xml:space="preserve">Either party may terminate this engagement by giving 30 days' written notice to the other party. We reserve the right to terminate this engagement immediately where fees remain unpaid or where you have not complied with your responsibilities as described in Section 3.</w:t>
+      </w:r>
+    </w:p>
+    <w:p>
+      <w:pPr>
+        <w:spacing w:before="120" w:after="120"/>
+        <w:jc w:val="center"/>
+      </w:pPr>
+      <w:r>
+        <w:rPr>
+          <w:rFonts w:ascii="Arial" w:cs="Arial" w:eastAsia="Arial" w:hAnsi="Arial"/>
+          <w:b/>
+          <w:bCs/>
+          <w:color w:val="000000"/>
+          <w:sz w:val="18"/>
+          <w:szCs w:val="18"/>
+        </w:rPr>
+        <w:t xml:space="preserve">{{ apes_305_reference }}</w:t>
       </w:r>
     </w:p>
     <w:p>
@@ -1633,873 +2419,6 @@
           <w:sz w:val="20"/>
           <w:szCs w:val="20"/>
         </w:rPr>
-        <w:t xml:space="preserve">{{ section_trust_dist }}. TRUST DISTRIBUTIONS — SPECIFIC TERMS</w:t>
-      </w:r>
-    </w:p>
-    <w:p>
-      <w:pPr>
-        <w:spacing w:before="120" w:after="120"/>
-      </w:pPr>
-      <w:r>
-        <w:rPr>
-          <w:rFonts w:ascii="Arial" w:cs="Arial" w:eastAsia="Arial" w:hAnsi="Arial"/>
-          <w:color w:val="000000"/>
-          <w:sz w:val="20"/>
-          <w:szCs w:val="20"/>
-        </w:rPr>
-        <w:t xml:space="preserve">For trust entities, trustee resolutions must be executed on or before 30 June each income year to be effective for that year. Failure to make a valid distribution resolution before this date may result in the ATO assessing the trustee on the entire net income of the trust at the top marginal tax rate.</w:t>
-      </w:r>
-    </w:p>
-    <w:p>
-      <w:pPr>
-        <w:spacing w:before="120" w:after="120"/>
-      </w:pPr>
-      <w:r>
-        <w:rPr>
-          <w:rFonts w:ascii="Arial" w:cs="Arial" w:eastAsia="Arial" w:hAnsi="Arial"/>
-          <w:color w:val="000000"/>
-          <w:sz w:val="20"/>
-          <w:szCs w:val="20"/>
-        </w:rPr>
-        <w:t xml:space="preserve">We will contact you prior to 30 June each year to obtain the information required to prepare the distribution resolution. It is your responsibility to respond promptly and to execute the resolution document before 30 June.</w:t>
-      </w:r>
-    </w:p>
-    <w:p>
-      <w:pPr>
-        <w:spacing w:before="120" w:after="120"/>
-      </w:pPr>
-      <w:r>
-        <w:rPr>
-          <w:rFonts w:ascii="Arial" w:cs="Arial" w:eastAsia="Arial" w:hAnsi="Arial"/>
-          <w:color w:val="000000"/>
-          <w:sz w:val="20"/>
-          <w:szCs w:val="20"/>
-        </w:rPr>
-        <w:t xml:space="preserve">We will also consider potential Section 100A risks in the context of trust distributions and advise you where we identify circumstances that may require further consideration.</w:t>
-      </w:r>
-    </w:p>
-    <w:p>
-      <w:pPr>
-        <w:spacing w:before="80" w:after="80"/>
-      </w:pPr>
-      <w:r>
-        <w:rPr>
-          <w:rFonts w:ascii="Courier New" w:cs="Courier New" w:eastAsia="Courier New" w:hAnsi="Courier New"/>
-          <w:color w:val="888888"/>
-          <w:sz w:val="16"/>
-          <w:szCs w:val="16"/>
-        </w:rPr>
-        <w:t xml:space="preserve">{% endif %}</w:t>
-      </w:r>
-    </w:p>
-    <w:p>
-      <w:pPr>
-        <w:pBdr>
-          <w:bottom w:val="single" w:color="000000" w:sz="6" w:space="3"/>
-        </w:pBdr>
-        <w:spacing w:before="240" w:after="80"/>
-      </w:pPr>
-      <w:r>
-        <w:rPr>
-          <w:rFonts w:ascii="Arial" w:cs="Arial" w:eastAsia="Arial" w:hAnsi="Arial"/>
-          <w:b/>
-          <w:bCs/>
-          <w:color w:val="000000"/>
-          <w:sz w:val="20"/>
-          <w:szCs w:val="20"/>
-        </w:rPr>
-        <w:t xml:space="preserve">{{ section_standards }}. PROFESSIONAL STANDARDS AND REGISTRATION</w:t>
-      </w:r>
-    </w:p>
-    <w:p>
-      <w:pPr>
-        <w:spacing w:before="120" w:after="120"/>
-      </w:pPr>
-      <w:r>
-        <w:rPr>
-          <w:rFonts w:ascii="Arial" w:cs="Arial" w:eastAsia="Arial" w:hAnsi="Arial"/>
-          <w:color w:val="000000"/>
-          <w:sz w:val="20"/>
-          <w:szCs w:val="20"/>
-        </w:rPr>
-        <w:t xml:space="preserve">{{ practice_name }} is a member of </w:t>
-      </w:r>
-      <w:r>
-        <w:rPr>
-          <w:rFonts w:ascii="Arial" w:cs="Arial" w:eastAsia="Arial" w:hAnsi="Arial"/>
-          <w:b/>
-          <w:bCs/>
-          <w:color w:val="000000"/>
-          <w:sz w:val="20"/>
-          <w:szCs w:val="20"/>
-        </w:rPr>
-        <w:t xml:space="preserve">{{ practice_professional_body }}</w:t>
-      </w:r>
-      <w:r>
-        <w:rPr>
-          <w:rFonts w:ascii="Arial" w:cs="Arial" w:eastAsia="Arial" w:hAnsi="Arial"/>
-          <w:color w:val="000000"/>
-          <w:sz w:val="20"/>
-          <w:szCs w:val="20"/>
-        </w:rPr>
-        <w:t xml:space="preserve"> and is bound by its professional standards, code of ethics, and continuing professional development requirements. All professional services are performed in accordance with these standards.</w:t>
-      </w:r>
-    </w:p>
-    <w:p>
-      <w:pPr>
-        <w:spacing w:before="120" w:after="120"/>
-      </w:pPr>
-      <w:r>
-        <w:rPr>
-          <w:rFonts w:ascii="Arial" w:cs="Arial" w:eastAsia="Arial" w:hAnsi="Arial"/>
-          <w:color w:val="000000"/>
-          <w:sz w:val="20"/>
-          <w:szCs w:val="20"/>
-        </w:rPr>
-        <w:t xml:space="preserve">{{ tpb_registration_statement }}</w:t>
-      </w:r>
-    </w:p>
-    <w:p>
-      <w:pPr>
-        <w:spacing w:before="120" w:after="120"/>
-      </w:pPr>
-      <w:r>
-        <w:rPr>
-          <w:rFonts w:ascii="Arial" w:cs="Arial" w:eastAsia="Arial" w:hAnsi="Arial"/>
-          <w:color w:val="000000"/>
-          <w:sz w:val="20"/>
-          <w:szCs w:val="20"/>
-        </w:rPr>
-        <w:t xml:space="preserve">{% if practice_bas_agent_number %}Where applicable, we are registered as a BAS Agent with the Tax Practitioners Board, registration number </w:t>
-      </w:r>
-      <w:r>
-        <w:rPr>
-          <w:rFonts w:ascii="Courier New" w:cs="Courier New" w:eastAsia="Courier New" w:hAnsi="Courier New"/>
-          <w:b/>
-          <w:bCs/>
-          <w:color w:val="000000"/>
-          <w:sz w:val="20"/>
-          <w:szCs w:val="20"/>
-        </w:rPr>
-        <w:t xml:space="preserve">{{ practice_bas_agent_number }}</w:t>
-      </w:r>
-      <w:r>
-        <w:rPr>
-          <w:rFonts w:ascii="Arial" w:cs="Arial" w:eastAsia="Arial" w:hAnsi="Arial"/>
-          <w:color w:val="000000"/>
-          <w:sz w:val="20"/>
-          <w:szCs w:val="20"/>
-        </w:rPr>
-        <w:t xml:space="preserve">.{% endif %}</w:t>
-      </w:r>
-    </w:p>
-    <w:p>
-      <w:pPr>
-        <w:pBdr>
-          <w:bottom w:val="single" w:color="000000" w:sz="6" w:space="3"/>
-        </w:pBdr>
-        <w:spacing w:before="240" w:after="80"/>
-      </w:pPr>
-      <w:r>
-        <w:rPr>
-          <w:rFonts w:ascii="Arial" w:cs="Arial" w:eastAsia="Arial" w:hAnsi="Arial"/>
-          <w:b/>
-          <w:bCs/>
-          <w:color w:val="000000"/>
-          <w:sz w:val="20"/>
-          <w:szCs w:val="20"/>
-        </w:rPr>
-        <w:t xml:space="preserve">{{ section_privacy }}. CONFIDENTIALITY, PRIVACY, AND DATA STORAGE</w:t>
-      </w:r>
-    </w:p>
-    <w:p>
-      <w:pPr>
-        <w:spacing w:before="120" w:after="120"/>
-      </w:pPr>
-      <w:r>
-        <w:rPr>
-          <w:rFonts w:ascii="Arial" w:cs="Arial" w:eastAsia="Arial" w:hAnsi="Arial"/>
-          <w:color w:val="000000"/>
-          <w:sz w:val="20"/>
-          <w:szCs w:val="20"/>
-        </w:rPr>
-        <w:t xml:space="preserve">We handle your personal and financial information in accordance with the </w:t>
-      </w:r>
-      <w:r>
-        <w:rPr>
-          <w:rFonts w:ascii="Arial" w:cs="Arial" w:eastAsia="Arial" w:hAnsi="Arial"/>
-          <w:b/>
-          <w:bCs/>
-          <w:color w:val="000000"/>
-          <w:sz w:val="20"/>
-          <w:szCs w:val="20"/>
-        </w:rPr>
-        <w:t xml:space="preserve">Privacy Act 1988 (Cth)</w:t>
-      </w:r>
-      <w:r>
-        <w:rPr>
-          <w:rFonts w:ascii="Arial" w:cs="Arial" w:eastAsia="Arial" w:hAnsi="Arial"/>
-          <w:color w:val="000000"/>
-          <w:sz w:val="20"/>
-          <w:szCs w:val="20"/>
-        </w:rPr>
-        <w:t xml:space="preserve"> and the Australian Privacy Principles (APPs). Our full Privacy Policy is available at </w:t>
-      </w:r>
-      <w:r>
-        <w:rPr>
-          <w:rFonts w:ascii="Courier New" w:cs="Courier New" w:eastAsia="Courier New" w:hAnsi="Courier New"/>
-          <w:b/>
-          <w:bCs/>
-          <w:color w:val="000000"/>
-          <w:sz w:val="20"/>
-          <w:szCs w:val="20"/>
-        </w:rPr>
-        <w:t xml:space="preserve">{{ practice_website }}</w:t>
-      </w:r>
-      <w:r>
-        <w:rPr>
-          <w:rFonts w:ascii="Arial" w:cs="Arial" w:eastAsia="Arial" w:hAnsi="Arial"/>
-          <w:color w:val="000000"/>
-          <w:sz w:val="20"/>
-          <w:szCs w:val="20"/>
-        </w:rPr>
-        <w:t xml:space="preserve">. By engaging us, you consent to the collection, use, and storage of your information as described in this section.</w:t>
-      </w:r>
-    </w:p>
-    <w:p>
-      <w:pPr>
-        <w:spacing w:before="120" w:after="120"/>
-      </w:pPr>
-      <w:r>
-        <w:rPr>
-          <w:rFonts w:ascii="Arial" w:cs="Arial" w:eastAsia="Arial" w:hAnsi="Arial"/>
-          <w:b/>
-          <w:bCs/>
-          <w:color w:val="000000"/>
-          <w:sz w:val="20"/>
-          <w:szCs w:val="20"/>
-        </w:rPr>
-        <w:t xml:space="preserve">Cloud-Based Practice Software.  </w:t>
-      </w:r>
-      <w:r>
-        <w:rPr>
-          <w:rFonts w:ascii="Arial" w:cs="Arial" w:eastAsia="Arial" w:hAnsi="Arial"/>
-          <w:color w:val="000000"/>
-          <w:sz w:val="20"/>
-          <w:szCs w:val="20"/>
-        </w:rPr>
-        <w:t xml:space="preserve">We use cloud-based practice management software to prepare, store, and manage your financial records, documents, correspondence, and tax data. This software is hosted on servers located in Australia. Your data is not sold, shared with third parties for commercial purposes, or used for any purpose other than providing the services described in this letter.</w:t>
-      </w:r>
-    </w:p>
-    <w:p>
-      <w:pPr>
-        <w:spacing w:before="120" w:after="120"/>
-      </w:pPr>
-      <w:r>
-        <w:rPr>
-          <w:rFonts w:ascii="Arial" w:cs="Arial" w:eastAsia="Arial" w:hAnsi="Arial"/>
-          <w:b/>
-          <w:bCs/>
-          <w:color w:val="000000"/>
-          <w:sz w:val="20"/>
-          <w:szCs w:val="20"/>
-        </w:rPr>
-        <w:t xml:space="preserve">Third-Party Service Providers.  </w:t>
-      </w:r>
-      <w:r>
-        <w:rPr>
-          <w:rFonts w:ascii="Arial" w:cs="Arial" w:eastAsia="Arial" w:hAnsi="Arial"/>
-          <w:color w:val="000000"/>
-          <w:sz w:val="20"/>
-          <w:szCs w:val="20"/>
-        </w:rPr>
-        <w:t xml:space="preserve">Where we engage third-party service providers to assist in delivering our services — including document signing platforms, accounting software integrations, and cloud infrastructure providers — those providers are bound by confidentiality obligations consistent with the Privacy Act 1988 (Cth). We will not share your information with third parties beyond what is strictly necessary to carry out your instructions.</w:t>
-      </w:r>
-    </w:p>
-    <w:p>
-      <w:pPr>
-        <w:spacing w:before="120" w:after="120"/>
-      </w:pPr>
-      <w:r>
-        <w:rPr>
-          <w:rFonts w:ascii="Arial" w:cs="Arial" w:eastAsia="Arial" w:hAnsi="Arial"/>
-          <w:b/>
-          <w:bCs/>
-          <w:color w:val="000000"/>
-          <w:sz w:val="20"/>
-          <w:szCs w:val="20"/>
-        </w:rPr>
-        <w:t xml:space="preserve">Regulatory Disclosure.  </w:t>
-      </w:r>
-      <w:r>
-        <w:rPr>
-          <w:rFonts w:ascii="Arial" w:cs="Arial" w:eastAsia="Arial" w:hAnsi="Arial"/>
-          <w:color w:val="000000"/>
-          <w:sz w:val="20"/>
-          <w:szCs w:val="20"/>
-        </w:rPr>
-        <w:t xml:space="preserve">We will disclose your information to the Australian Taxation Office, ASIC, state revenue authorities, and other regulatory bodies only where required by law or where necessary to carry out your instructions, such as lodging returns and statements on your behalf.</w:t>
-      </w:r>
-    </w:p>
-    <w:p>
-      <w:pPr>
-        <w:spacing w:before="80" w:after="80"/>
-      </w:pPr>
-      <w:r>
-        <w:rPr>
-          <w:rFonts w:ascii="Courier New" w:cs="Courier New" w:eastAsia="Courier New" w:hAnsi="Courier New"/>
-          <w:color w:val="888888"/>
-          <w:sz w:val="16"/>
-          <w:szCs w:val="16"/>
-        </w:rPr>
-        <w:t xml:space="preserve">{% if show_client_portal %}</w:t>
-      </w:r>
-    </w:p>
-    <w:p>
-      <w:pPr>
-        <w:spacing w:before="120" w:after="120"/>
-      </w:pPr>
-      <w:r>
-        <w:rPr>
-          <w:rFonts w:ascii="Arial" w:cs="Arial" w:eastAsia="Arial" w:hAnsi="Arial"/>
-          <w:b/>
-          <w:bCs/>
-          <w:color w:val="000000"/>
-          <w:sz w:val="20"/>
-          <w:szCs w:val="20"/>
-        </w:rPr>
-        <w:t xml:space="preserve">Client Portal.  </w:t>
-      </w:r>
-      <w:r>
-        <w:rPr>
-          <w:rFonts w:ascii="Arial" w:cs="Arial" w:eastAsia="Arial" w:hAnsi="Arial"/>
-          <w:color w:val="000000"/>
-          <w:sz w:val="20"/>
-          <w:szCs w:val="20"/>
-        </w:rPr>
-        <w:t xml:space="preserve">We provide access to a secure client portal at </w:t>
-      </w:r>
-      <w:r>
-        <w:rPr>
-          <w:rFonts w:ascii="Courier New" w:cs="Courier New" w:eastAsia="Courier New" w:hAnsi="Courier New"/>
-          <w:b/>
-          <w:bCs/>
-          <w:color w:val="000000"/>
-          <w:sz w:val="20"/>
-          <w:szCs w:val="20"/>
-        </w:rPr>
-        <w:t xml:space="preserve">{{ client_portal_url }}</w:t>
-      </w:r>
-      <w:r>
-        <w:rPr>
-          <w:rFonts w:ascii="Arial" w:cs="Arial" w:eastAsia="Arial" w:hAnsi="Arial"/>
-          <w:color w:val="000000"/>
-          <w:sz w:val="20"/>
-          <w:szCs w:val="20"/>
-        </w:rPr>
-        <w:t xml:space="preserve">. The portal allows you to view documents, approve financial statements, and communicate with our team securely. By accessing the portal, you accept the applicable terms of service for that platform. Access credentials will be provided to you separately.</w:t>
-      </w:r>
-    </w:p>
-    <w:p>
-      <w:pPr>
-        <w:spacing w:before="80" w:after="80"/>
-      </w:pPr>
-      <w:r>
-        <w:rPr>
-          <w:rFonts w:ascii="Courier New" w:cs="Courier New" w:eastAsia="Courier New" w:hAnsi="Courier New"/>
-          <w:color w:val="888888"/>
-          <w:sz w:val="16"/>
-          <w:szCs w:val="16"/>
-        </w:rPr>
-        <w:t xml:space="preserve">{% endif %}</w:t>
-      </w:r>
-    </w:p>
-    <w:p>
-      <w:pPr>
-        <w:spacing w:before="80" w:after="80"/>
-      </w:pPr>
-      <w:r>
-        <w:rPr>
-          <w:rFonts w:ascii="Courier New" w:cs="Courier New" w:eastAsia="Courier New" w:hAnsi="Courier New"/>
-          <w:color w:val="888888"/>
-          <w:sz w:val="16"/>
-          <w:szCs w:val="16"/>
-        </w:rPr>
-        <w:t xml:space="preserve">{% if show_fusesign %}</w:t>
-      </w:r>
-    </w:p>
-    <w:p>
-      <w:pPr>
-        <w:spacing w:before="120" w:after="120"/>
-      </w:pPr>
-      <w:r>
-        <w:rPr>
-          <w:rFonts w:ascii="Arial" w:cs="Arial" w:eastAsia="Arial" w:hAnsi="Arial"/>
-          <w:b/>
-          <w:bCs/>
-          <w:color w:val="000000"/>
-          <w:sz w:val="20"/>
-          <w:szCs w:val="20"/>
-        </w:rPr>
-        <w:t xml:space="preserve">Electronic Document Signing.  </w:t>
-      </w:r>
-      <w:r>
-        <w:rPr>
-          <w:rFonts w:ascii="Arial" w:cs="Arial" w:eastAsia="Arial" w:hAnsi="Arial"/>
-          <w:color w:val="000000"/>
-          <w:sz w:val="20"/>
-          <w:szCs w:val="20"/>
-        </w:rPr>
-        <w:t xml:space="preserve">We use an electronic document signing platform to send documents to you for execution. This platform processes your name, email address, and electronic signature for the sole purpose of executing documents relating to your engagement with us. By signing documents electronically, you accept the applicable terms of that platform. Electronic signatures applied through this service are legally binding under the </w:t>
-      </w:r>
-      <w:r>
-        <w:rPr>
-          <w:rFonts w:ascii="Arial" w:cs="Arial" w:eastAsia="Arial" w:hAnsi="Arial"/>
-          <w:b/>
-          <w:bCs/>
-          <w:color w:val="000000"/>
-          <w:sz w:val="20"/>
-          <w:szCs w:val="20"/>
-        </w:rPr>
-        <w:t xml:space="preserve">Electronic Transactions Act 1999 (Cth)</w:t>
-      </w:r>
-      <w:r>
-        <w:rPr>
-          <w:rFonts w:ascii="Arial" w:cs="Arial" w:eastAsia="Arial" w:hAnsi="Arial"/>
-          <w:color w:val="000000"/>
-          <w:sz w:val="20"/>
-          <w:szCs w:val="20"/>
-        </w:rPr>
-        <w:t xml:space="preserve">.</w:t>
-      </w:r>
-    </w:p>
-    <w:p>
-      <w:pPr>
-        <w:spacing w:before="80" w:after="80"/>
-      </w:pPr>
-      <w:r>
-        <w:rPr>
-          <w:rFonts w:ascii="Courier New" w:cs="Courier New" w:eastAsia="Courier New" w:hAnsi="Courier New"/>
-          <w:color w:val="888888"/>
-          <w:sz w:val="16"/>
-          <w:szCs w:val="16"/>
-        </w:rPr>
-        <w:t xml:space="preserve">{% endif %}</w:t>
-      </w:r>
-    </w:p>
-    <w:p>
-      <w:pPr>
-        <w:spacing w:before="120" w:after="120"/>
-      </w:pPr>
-      <w:r>
-        <w:rPr>
-          <w:rFonts w:ascii="Arial" w:cs="Arial" w:eastAsia="Arial" w:hAnsi="Arial"/>
-          <w:b/>
-          <w:bCs/>
-          <w:color w:val="000000"/>
-          <w:sz w:val="20"/>
-          <w:szCs w:val="20"/>
-        </w:rPr>
-        <w:t xml:space="preserve">Data Retention.  </w:t>
-      </w:r>
-      <w:r>
-        <w:rPr>
-          <w:rFonts w:ascii="Arial" w:cs="Arial" w:eastAsia="Arial" w:hAnsi="Arial"/>
-          <w:color w:val="000000"/>
-          <w:sz w:val="20"/>
-          <w:szCs w:val="20"/>
-        </w:rPr>
-        <w:t xml:space="preserve">We retain your financial records and documents for a minimum of seven years from the date of the relevant return, document, or transaction, in accordance with ATO record-keeping requirements and our obligations under the </w:t>
-      </w:r>
-      <w:r>
-        <w:rPr>
-          <w:rFonts w:ascii="Arial" w:cs="Arial" w:eastAsia="Arial" w:hAnsi="Arial"/>
-          <w:b/>
-          <w:bCs/>
-          <w:color w:val="000000"/>
-          <w:sz w:val="20"/>
-          <w:szCs w:val="20"/>
-        </w:rPr>
-        <w:t xml:space="preserve">Tax Agent Services Act 2009</w:t>
-      </w:r>
-      <w:r>
-        <w:rPr>
-          <w:rFonts w:ascii="Arial" w:cs="Arial" w:eastAsia="Arial" w:hAnsi="Arial"/>
-          <w:color w:val="000000"/>
-          <w:sz w:val="20"/>
-          <w:szCs w:val="20"/>
-        </w:rPr>
-        <w:t xml:space="preserve">. After this period, records may be securely destroyed unless you notify us in writing prior to that time that you wish to retain them.</w:t>
-      </w:r>
-    </w:p>
-    <w:p>
-      <w:pPr>
-        <w:spacing w:before="120" w:after="120"/>
-      </w:pPr>
-      <w:r>
-        <w:rPr>
-          <w:rFonts w:ascii="Arial" w:cs="Arial" w:eastAsia="Arial" w:hAnsi="Arial"/>
-          <w:b/>
-          <w:bCs/>
-          <w:color w:val="000000"/>
-          <w:sz w:val="20"/>
-          <w:szCs w:val="20"/>
-        </w:rPr>
-        <w:t xml:space="preserve">Access and Correction.  </w:t>
-      </w:r>
-      <w:r>
-        <w:rPr>
-          <w:rFonts w:ascii="Arial" w:cs="Arial" w:eastAsia="Arial" w:hAnsi="Arial"/>
-          <w:color w:val="000000"/>
-          <w:sz w:val="20"/>
-          <w:szCs w:val="20"/>
-        </w:rPr>
-        <w:t xml:space="preserve">You have the right to access the personal information we hold about you and to request corrections where that information is inaccurate, incomplete, or out of date. To make a request, contact us at </w:t>
-      </w:r>
-      <w:r>
-        <w:rPr>
-          <w:rFonts w:ascii="Courier New" w:cs="Courier New" w:eastAsia="Courier New" w:hAnsi="Courier New"/>
-          <w:b/>
-          <w:bCs/>
-          <w:color w:val="000000"/>
-          <w:sz w:val="20"/>
-          <w:szCs w:val="20"/>
-        </w:rPr>
-        <w:t xml:space="preserve">{{ practice_email }}</w:t>
-      </w:r>
-      <w:r>
-        <w:rPr>
-          <w:rFonts w:ascii="Arial" w:cs="Arial" w:eastAsia="Arial" w:hAnsi="Arial"/>
-          <w:color w:val="000000"/>
-          <w:sz w:val="20"/>
-          <w:szCs w:val="20"/>
-        </w:rPr>
-        <w:t xml:space="preserve">. We will respond within 30 days.</w:t>
-      </w:r>
-    </w:p>
-    <w:p>
-      <w:pPr>
-        <w:spacing w:before="120" w:after="120"/>
-      </w:pPr>
-      <w:r>
-        <w:rPr>
-          <w:rFonts w:ascii="Arial" w:cs="Arial" w:eastAsia="Arial" w:hAnsi="Arial"/>
-          <w:color w:val="000000"/>
-          <w:sz w:val="20"/>
-          <w:szCs w:val="20"/>
-        </w:rPr>
-        <w:t xml:space="preserve">If you do not wish us to use your information in a particular way, please advise us in writing. We will consider your request, noting that in some cases this may affect our ability to provide the services described in this letter.</w:t>
-      </w:r>
-    </w:p>
-    <w:p>
-      <w:pPr>
-        <w:pBdr>
-          <w:bottom w:val="single" w:color="000000" w:sz="6" w:space="3"/>
-        </w:pBdr>
-        <w:spacing w:before="240" w:after="80"/>
-      </w:pPr>
-      <w:r>
-        <w:rPr>
-          <w:rFonts w:ascii="Arial" w:cs="Arial" w:eastAsia="Arial" w:hAnsi="Arial"/>
-          <w:b/>
-          <w:bCs/>
-          <w:color w:val="000000"/>
-          <w:sz w:val="20"/>
-          <w:szCs w:val="20"/>
-        </w:rPr>
-        <w:t xml:space="preserve">{{ section_liability }}. LIMITATION OF LIABILITY</w:t>
-      </w:r>
-    </w:p>
-    <w:p>
-      <w:pPr>
-        <w:spacing w:before="120" w:after="120"/>
-      </w:pPr>
-      <w:r>
-        <w:rPr>
-          <w:rFonts w:ascii="Arial" w:cs="Arial" w:eastAsia="Arial" w:hAnsi="Arial"/>
-          <w:color w:val="000000"/>
-          <w:sz w:val="20"/>
-          <w:szCs w:val="20"/>
-        </w:rPr>
-        <w:t xml:space="preserve">Our liability to you arising out of or in connection with this engagement is limited to the fees paid by you to us for the specific services giving rise to the liability, or to the extent permitted by law, the maximum amount our professional indemnity insurance will cover in respect of that claim.</w:t>
-      </w:r>
-    </w:p>
-    <w:p>
-      <w:pPr>
-        <w:spacing w:before="120" w:after="120"/>
-      </w:pPr>
-      <w:r>
-        <w:rPr>
-          <w:rFonts w:ascii="Arial" w:cs="Arial" w:eastAsia="Arial" w:hAnsi="Arial"/>
-          <w:color w:val="000000"/>
-          <w:sz w:val="20"/>
-          <w:szCs w:val="20"/>
-        </w:rPr>
-        <w:t xml:space="preserve">We are not liable for any loss, damage, or expense arising from our reliance on information provided by you that was incomplete, inaccurate, or misleading. We are not liable for any indirect, consequential, special, or incidental loss or damage.</w:t>
-      </w:r>
-    </w:p>
-    <w:p>
-      <w:pPr>
-        <w:spacing w:before="120" w:after="120"/>
-      </w:pPr>
-      <w:r>
-        <w:rPr>
-          <w:rFonts w:ascii="Arial" w:cs="Arial" w:eastAsia="Arial" w:hAnsi="Arial"/>
-          <w:color w:val="000000"/>
-          <w:sz w:val="20"/>
-          <w:szCs w:val="20"/>
-        </w:rPr>
-        <w:t xml:space="preserve">Nothing in this clause limits our liability for fraud, wilful misconduct, or any liability that cannot be excluded by law.</w:t>
-      </w:r>
-    </w:p>
-    <w:p>
-      <w:pPr>
-        <w:pBdr>
-          <w:bottom w:val="single" w:color="000000" w:sz="6" w:space="3"/>
-        </w:pBdr>
-        <w:spacing w:before="240" w:after="80"/>
-      </w:pPr>
-      <w:r>
-        <w:rPr>
-          <w:rFonts w:ascii="Arial" w:cs="Arial" w:eastAsia="Arial" w:hAnsi="Arial"/>
-          <w:b/>
-          <w:bCs/>
-          <w:color w:val="000000"/>
-          <w:sz w:val="20"/>
-          <w:szCs w:val="20"/>
-        </w:rPr>
-        <w:t xml:space="preserve">{{ section_dispute }}. DISPUTE RESOLUTION</w:t>
-      </w:r>
-    </w:p>
-    <w:p>
-      <w:pPr>
-        <w:spacing w:before="120" w:after="120"/>
-      </w:pPr>
-      <w:r>
-        <w:rPr>
-          <w:rFonts w:ascii="Arial" w:cs="Arial" w:eastAsia="Arial" w:hAnsi="Arial"/>
-          <w:color w:val="000000"/>
-          <w:sz w:val="20"/>
-          <w:szCs w:val="20"/>
-        </w:rPr>
-        <w:t xml:space="preserve">If a dispute arises from this engagement, we ask that you first raise the matter directly with the partner responsible for your engagement so that we may attempt to resolve it. If we are unable to resolve the dispute, either party may refer the matter to the complaints process of </w:t>
-      </w:r>
-      <w:r>
-        <w:rPr>
-          <w:rFonts w:ascii="Arial" w:cs="Arial" w:eastAsia="Arial" w:hAnsi="Arial"/>
-          <w:b/>
-          <w:bCs/>
-          <w:color w:val="000000"/>
-          <w:sz w:val="20"/>
-          <w:szCs w:val="20"/>
-        </w:rPr>
-        <w:t xml:space="preserve">{{ practice_professional_body }}</w:t>
-      </w:r>
-      <w:r>
-        <w:rPr>
-          <w:rFonts w:ascii="Arial" w:cs="Arial" w:eastAsia="Arial" w:hAnsi="Arial"/>
-          <w:color w:val="000000"/>
-          <w:sz w:val="20"/>
-          <w:szCs w:val="20"/>
-        </w:rPr>
-        <w:t xml:space="preserve"> in accordance with their dispute resolution procedures.</w:t>
-      </w:r>
-    </w:p>
-    <w:p>
-      <w:pPr>
-        <w:spacing w:before="120" w:after="120"/>
-      </w:pPr>
-      <w:r>
-        <w:rPr>
-          <w:rFonts w:ascii="Arial" w:cs="Arial" w:eastAsia="Arial" w:hAnsi="Arial"/>
-          <w:color w:val="000000"/>
-          <w:sz w:val="20"/>
-          <w:szCs w:val="20"/>
-        </w:rPr>
-        <w:t xml:space="preserve">This engagement is governed by the laws of Victoria, Australia.</w:t>
-      </w:r>
-    </w:p>
-    <w:p>
-      <w:pPr>
-        <w:spacing w:before="80" w:after="80"/>
-      </w:pPr>
-      <w:r>
-        <w:rPr>
-          <w:rFonts w:ascii="Courier New" w:cs="Courier New" w:eastAsia="Courier New" w:hAnsi="Courier New"/>
-          <w:color w:val="888888"/>
-          <w:sz w:val="16"/>
-          <w:szCs w:val="16"/>
-        </w:rPr>
-        <w:t xml:space="preserve">{% if show_additional_terms %}</w:t>
-      </w:r>
-    </w:p>
-    <w:p>
-      <w:pPr>
-        <w:pBdr>
-          <w:bottom w:val="single" w:color="000000" w:sz="6" w:space="3"/>
-        </w:pBdr>
-        <w:spacing w:before="240" w:after="80"/>
-      </w:pPr>
-      <w:r>
-        <w:rPr>
-          <w:rFonts w:ascii="Arial" w:cs="Arial" w:eastAsia="Arial" w:hAnsi="Arial"/>
-          <w:b/>
-          <w:bCs/>
-          <w:color w:val="000000"/>
-          <w:sz w:val="20"/>
-          <w:szCs w:val="20"/>
-        </w:rPr>
-        <w:t xml:space="preserve">{{ section_additional }}. ADDITIONAL TERMS</w:t>
-      </w:r>
-    </w:p>
-    <w:p>
-      <w:pPr>
-        <w:spacing w:before="120" w:after="120"/>
-      </w:pPr>
-      <w:r>
-        <w:rPr>
-          <w:rFonts w:ascii="Courier New" w:cs="Courier New" w:eastAsia="Courier New" w:hAnsi="Courier New"/>
-          <w:b/>
-          <w:bCs/>
-          <w:color w:val="000000"/>
-          <w:sz w:val="20"/>
-          <w:szCs w:val="20"/>
-        </w:rPr>
-        <w:t xml:space="preserve">{{ additional_terms }}</w:t>
-      </w:r>
-    </w:p>
-    <w:p>
-      <w:pPr>
-        <w:spacing w:before="80" w:after="80"/>
-      </w:pPr>
-      <w:r>
-        <w:rPr>
-          <w:rFonts w:ascii="Courier New" w:cs="Courier New" w:eastAsia="Courier New" w:hAnsi="Courier New"/>
-          <w:color w:val="888888"/>
-          <w:sz w:val="16"/>
-          <w:szCs w:val="16"/>
-        </w:rPr>
-        <w:t xml:space="preserve">{% endif %}</w:t>
-      </w:r>
-    </w:p>
-    <w:p>
-      <w:pPr>
-        <w:pBdr>
-          <w:bottom w:val="single" w:color="000000" w:sz="6" w:space="3"/>
-        </w:pBdr>
-        <w:spacing w:before="240" w:after="80"/>
-      </w:pPr>
-      <w:r>
-        <w:rPr>
-          <w:rFonts w:ascii="Arial" w:cs="Arial" w:eastAsia="Arial" w:hAnsi="Arial"/>
-          <w:b/>
-          <w:bCs/>
-          <w:color w:val="000000"/>
-          <w:sz w:val="20"/>
-          <w:szCs w:val="20"/>
-        </w:rPr>
-        <w:t xml:space="preserve">{{ section_commencement }}. COMMENCEMENT</w:t>
-      </w:r>
-    </w:p>
-    <w:p>
-      <w:pPr>
-        <w:spacing w:before="120" w:after="120"/>
-      </w:pPr>
-      <w:r>
-        <w:rPr>
-          <w:rFonts w:ascii="Arial" w:cs="Arial" w:eastAsia="Arial" w:hAnsi="Arial"/>
-          <w:color w:val="000000"/>
-          <w:sz w:val="20"/>
-          <w:szCs w:val="20"/>
-        </w:rPr>
-        <w:t xml:space="preserve">This engagement letter takes effect from the date of acceptance below and continues until terminated by either party in writing, or until superseded by a new engagement letter.</w:t>
-      </w:r>
-    </w:p>
-    <w:p>
-      <w:pPr>
-        <w:spacing w:before="120" w:after="120"/>
-      </w:pPr>
-      <w:r>
-        <w:rPr>
-          <w:rFonts w:ascii="Arial" w:cs="Arial" w:eastAsia="Arial" w:hAnsi="Arial"/>
-          <w:color w:val="000000"/>
-          <w:sz w:val="20"/>
-          <w:szCs w:val="20"/>
-        </w:rPr>
-        <w:t xml:space="preserve">Either party may terminate this engagement by giving 30 days' written notice to the other party. We reserve the right to terminate this engagement immediately where fees remain unpaid or where you have not complied with your responsibilities as described in Section 3.</w:t>
-      </w:r>
-    </w:p>
-    <w:p>
-      <w:pPr>
-        <w:spacing w:before="0" w:after="0"/>
-      </w:pPr>
-      <w:r>
-        <w:t xml:space="preserve"/>
-      </w:r>
-    </w:p>
-    <w:p>
-      <w:pPr>
-        <w:pBdr>
-          <w:bottom w:val="single" w:color="999999" w:sz="4" w:space="1"/>
-        </w:pBdr>
-        <w:spacing w:before="140" w:after="140"/>
-      </w:pPr>
-      <w:r>
-        <w:t xml:space="preserve"/>
-      </w:r>
-    </w:p>
-    <w:p>
-      <w:pPr>
-        <w:spacing w:before="120" w:after="120"/>
-        <w:jc w:val="center"/>
-      </w:pPr>
-      <w:r>
-        <w:rPr>
-          <w:rFonts w:ascii="Arial" w:cs="Arial" w:eastAsia="Arial" w:hAnsi="Arial"/>
-          <w:b/>
-          <w:bCs/>
-          <w:color w:val="000000"/>
-          <w:sz w:val="18"/>
-          <w:szCs w:val="18"/>
-        </w:rPr>
-        <w:t xml:space="preserve">{{ apes_305_reference }}</w:t>
-      </w:r>
-    </w:p>
-    <w:p>
-      <w:pPr>
-        <w:pBdr>
-          <w:bottom w:val="single" w:color="999999" w:sz="4" w:space="1"/>
-        </w:pBdr>
-        <w:spacing w:before="140" w:after="140"/>
-      </w:pPr>
-      <w:r>
-        <w:t xml:space="preserve"/>
-      </w:r>
-    </w:p>
-    <w:p>
-      <w:pPr>
-        <w:spacing w:before="0" w:after="0"/>
-      </w:pPr>
-      <w:r>
-        <w:t xml:space="preserve"/>
-      </w:r>
-    </w:p>
-    <w:p>
-      <w:pPr>
-        <w:pBdr>
-          <w:bottom w:val="single" w:color="000000" w:sz="6" w:space="3"/>
-        </w:pBdr>
-        <w:spacing w:before="240" w:after="80"/>
-      </w:pPr>
-      <w:r>
-        <w:rPr>
-          <w:rFonts w:ascii="Arial" w:cs="Arial" w:eastAsia="Arial" w:hAnsi="Arial"/>
-          <w:b/>
-          <w:bCs/>
-          <w:color w:val="000000"/>
-          <w:sz w:val="20"/>
-          <w:szCs w:val="20"/>
-        </w:rPr>
         <w:t xml:space="preserve">ACCEPTANCE OF TERMS</w:t>
       </w:r>
     </w:p>
@@ -2529,14 +2448,6 @@
           <w:szCs w:val="20"/>
         </w:rPr>
         <w:t xml:space="preserve">You may return the signed letter by email, post, or via the electronic signature process if we have sent this letter through our secure document signing platform.</w:t>
-      </w:r>
-    </w:p>
-    <w:p>
-      <w:pPr>
-        <w:spacing w:before="0" w:after="0"/>
-      </w:pPr>
-      <w:r>
-        <w:t xml:space="preserve"/>
       </w:r>
     </w:p>
     <w:p>
@@ -3478,17 +3389,6 @@
     <w:p>
       <w:pPr>
         <w:spacing w:before="0" w:after="0"/>
-      </w:pPr>
-      <w:r>
-        <w:t xml:space="preserve"/>
-      </w:r>
-    </w:p>
-    <w:p>
-      <w:pPr>
-        <w:pBdr>
-          <w:bottom w:val="single" w:color="999999" w:sz="4" w:space="1"/>
-        </w:pBdr>
-        <w:spacing w:before="140" w:after="140"/>
       </w:pPr>
       <w:r>
         <w:t xml:space="preserve"/>

</xml_diff>

<commit_message>
fix: remove orphaned endfor tags from engagement letter template
Removed 3 standalone {% endfor %} paragraphs that had no matching
{% for %} opener — leftover from the static-to-loop conversion.
Preserved the {%tr endfor %} in the services table loop.

After deploying, re-seed the template:
  python3 manage.py seed_engagement_letter_template \
    --file core/management/commands/Engagement_Letter_TEMPLATE_BW_v3.docx --force

Co-Authored-By: Claude Opus 4.6 (1M context) <noreply@anthropic.com>
</commit_message>
<xml_diff>
--- a/core/management/commands/Engagement_Letter_TEMPLATE_BW_v3.docx
+++ b/core/management/commands/Engagement_Letter_TEMPLATE_BW_v3.docx
@@ -1,6 +1,6 @@
 
 <file path=word/document.xml><?xml version="1.0" encoding="utf-8"?>
-<w:document xmlns:mc="http://schemas.openxmlformats.org/markup-compatibility/2006" xmlns:r="http://schemas.openxmlformats.org/officeDocument/2006/relationships" xmlns:w="http://schemas.openxmlformats.org/wordprocessingml/2006/main" mc:Ignorable="w14 w15 wp14">
+<w:document xmlns:wpc="http://schemas.microsoft.com/office/word/2010/wordprocessingCanvas" xmlns:mc="http://schemas.openxmlformats.org/markup-compatibility/2006" xmlns:o="urn:schemas-microsoft-com:office:office" xmlns:r="http://schemas.openxmlformats.org/officeDocument/2006/relationships" xmlns:m="http://schemas.openxmlformats.org/officeDocument/2006/math" xmlns:v="urn:schemas-microsoft-com:vml" xmlns:wp14="http://schemas.microsoft.com/office/word/2010/wordprocessingDrawing" xmlns:wp="http://schemas.openxmlformats.org/drawingml/2006/wordprocessingDrawing" xmlns:w10="urn:schemas-microsoft-com:office:word" xmlns:w="http://schemas.openxmlformats.org/wordprocessingml/2006/main" xmlns:w14="http://schemas.microsoft.com/office/word/2010/wordml" xmlns:w15="http://schemas.microsoft.com/office/word/2012/wordml" xmlns:wpg="http://schemas.microsoft.com/office/word/2010/wordprocessingGroup" xmlns:wpi="http://schemas.microsoft.com/office/word/2010/wordprocessingInk" xmlns:wne="http://schemas.microsoft.com/office/word/2006/wordml" xmlns:wps="http://schemas.microsoft.com/office/word/2010/wordprocessingShape" xmlns:cx="http://schemas.microsoft.com/office/drawing/2014/chartex" xmlns:cx1="http://schemas.microsoft.com/office/drawing/2015/9/8/chartex" xmlns:cx2="http://schemas.microsoft.com/office/drawing/2015/10/21/chartex" xmlns:cx3="http://schemas.microsoft.com/office/drawing/2016/5/9/chartex" xmlns:cx4="http://schemas.microsoft.com/office/drawing/2016/5/10/chartex" xmlns:cx5="http://schemas.microsoft.com/office/drawing/2016/5/11/chartex" xmlns:cx6="http://schemas.microsoft.com/office/drawing/2016/5/12/chartex" xmlns:cx7="http://schemas.microsoft.com/office/drawing/2016/5/13/chartex" xmlns:cx8="http://schemas.microsoft.com/office/drawing/2016/5/14/chartex" xmlns:aink="http://schemas.microsoft.com/office/drawing/2016/ink" xmlns:am3d="http://schemas.microsoft.com/office/drawing/2017/model3d" xmlns:w16cex="http://schemas.microsoft.com/office/word/2018/wordml/cex" xmlns:w16cid="http://schemas.microsoft.com/office/word/2016/wordml/cid" xmlns:w16="http://schemas.microsoft.com/office/word/2018/wordml" xmlns:w16sdtdh="http://schemas.microsoft.com/office/word/2020/wordml/sdtdatahash" xmlns:w16se="http://schemas.microsoft.com/office/word/2015/wordml/symex" mc:Ignorable="w14 w15 wp14">
   <w:body>
     <w:tbl>
       <w:tblPr>
@@ -185,6 +185,17 @@
     </w:tbl>
     <w:p>
       <w:pPr>
+        <w:pBdr>
+          <w:bottom w:val="single" w:color="999999" w:sz="4" w:space="1"/>
+        </w:pBdr>
+        <w:spacing w:before="140" w:after="140"/>
+      </w:pPr>
+      <w:r>
+        <w:t xml:space="preserve"/>
+      </w:r>
+    </w:p>
+    <w:p>
+      <w:pPr>
         <w:spacing w:before="0" w:after="0"/>
       </w:pPr>
       <w:r>
@@ -386,6 +397,14 @@
     </w:tbl>
     <w:p>
       <w:pPr>
+        <w:spacing w:before="0" w:after="0"/>
+      </w:pPr>
+      <w:r>
+        <w:t xml:space="preserve"/>
+      </w:r>
+    </w:p>
+    <w:p>
+      <w:pPr>
         <w:spacing w:before="120" w:after="120"/>
       </w:pPr>
       <w:r>
@@ -527,7 +546,7 @@
         <w:pBdr>
           <w:bottom w:val="single" w:color="000000" w:sz="6" w:space="3"/>
         </w:pBdr>
-        <w:spacing w:before="280" w:after="120"/>
+        <w:spacing w:before="240" w:after="80"/>
       </w:pPr>
       <w:r>
         <w:rPr>
@@ -553,6 +572,14 @@
           <w:szCs w:val="20"/>
         </w:rPr>
         <w:t xml:space="preserve">We have been engaged to provide the following services. Only those services marked below are included in this engagement:</w:t>
+      </w:r>
+    </w:p>
+    <w:p>
+      <w:pPr>
+        <w:spacing w:before="0" w:after="0"/>
+      </w:pPr>
+      <w:r>
+        <w:t xml:space="preserve"/>
       </w:r>
     </w:p>
     <w:tbl>
@@ -732,6 +759,14 @@
     </w:tbl>
     <w:p>
       <w:pPr>
+        <w:spacing w:before="0" w:after="0"/>
+      </w:pPr>
+      <w:r>
+        <w:t xml:space="preserve"/>
+      </w:r>
+    </w:p>
+    <w:p>
+      <w:pPr>
         <w:spacing w:before="120" w:after="120"/>
       </w:pPr>
       <w:r>
@@ -749,7 +784,7 @@
         <w:pBdr>
           <w:bottom w:val="single" w:color="000000" w:sz="6" w:space="3"/>
         </w:pBdr>
-        <w:spacing w:before="280" w:after="120"/>
+        <w:spacing w:before="240" w:after="80"/>
       </w:pPr>
       <w:r>
         <w:rPr>
@@ -982,7 +1017,7 @@
         <w:pBdr>
           <w:bottom w:val="single" w:color="000000" w:sz="6" w:space="3"/>
         </w:pBdr>
-        <w:spacing w:before="280" w:after="120"/>
+        <w:spacing w:before="240" w:after="80"/>
       </w:pPr>
       <w:r>
         <w:rPr>
@@ -1126,6 +1161,14 @@
     </w:p>
     <w:p>
       <w:pPr>
+        <w:spacing w:before="0" w:after="0"/>
+      </w:pPr>
+      <w:r>
+        <w:t xml:space="preserve"/>
+      </w:r>
+    </w:p>
+    <w:p>
+      <w:pPr>
         <w:spacing w:before="120" w:after="120"/>
       </w:pPr>
       <w:r>
@@ -1143,7 +1186,7 @@
         <w:pBdr>
           <w:bottom w:val="single" w:color="000000" w:sz="6" w:space="3"/>
         </w:pBdr>
-        <w:spacing w:before="280" w:after="120"/>
+        <w:spacing w:before="240" w:after="80"/>
       </w:pPr>
       <w:r>
         <w:rPr>
@@ -1285,7 +1328,7 @@
         <w:pBdr>
           <w:bottom w:val="single" w:color="000000" w:sz="6" w:space="3"/>
         </w:pBdr>
-        <w:spacing w:before="280" w:after="120"/>
+        <w:spacing w:before="240" w:after="80"/>
       </w:pPr>
       <w:r>
         <w:rPr>
@@ -1470,7 +1513,7 @@
         <w:pBdr>
           <w:bottom w:val="single" w:color="000000" w:sz="6" w:space="3"/>
         </w:pBdr>
-        <w:spacing w:before="280" w:after="120"/>
+        <w:spacing w:before="240" w:after="80"/>
       </w:pPr>
       <w:r>
         <w:rPr>
@@ -1572,835 +1615,6 @@
           <w:szCs w:val="16"/>
         </w:rPr>
         <w:t xml:space="preserve">{% if show_service_trust_distribution %}</w:t>
-      </w:r>
-    </w:p>
-    <w:p>
-      <w:pPr>
-        <w:pBdr>
-          <w:bottom w:val="single" w:color="000000" w:sz="6" w:space="3"/>
-        </w:pBdr>
-        <w:spacing w:before="280" w:after="120"/>
-      </w:pPr>
-      <w:r>
-        <w:rPr>
-          <w:rFonts w:ascii="Arial" w:cs="Arial" w:eastAsia="Arial" w:hAnsi="Arial"/>
-          <w:b/>
-          <w:bCs/>
-          <w:color w:val="000000"/>
-          <w:sz w:val="20"/>
-          <w:szCs w:val="20"/>
-        </w:rPr>
-        <w:t xml:space="preserve">{{ section_trust_dist }}. TRUST DISTRIBUTIONS — SPECIFIC TERMS</w:t>
-      </w:r>
-    </w:p>
-    <w:p>
-      <w:pPr>
-        <w:spacing w:before="120" w:after="120"/>
-      </w:pPr>
-      <w:r>
-        <w:rPr>
-          <w:rFonts w:ascii="Arial" w:cs="Arial" w:eastAsia="Arial" w:hAnsi="Arial"/>
-          <w:color w:val="000000"/>
-          <w:sz w:val="20"/>
-          <w:szCs w:val="20"/>
-        </w:rPr>
-        <w:t xml:space="preserve">For trust entities, trustee resolutions must be executed on or before 30 June each income year to be effective for that year. Failure to make a valid distribution resolution before this date may result in the ATO assessing the trustee on the entire net income of the trust at the top marginal tax rate.</w:t>
-      </w:r>
-    </w:p>
-    <w:p>
-      <w:pPr>
-        <w:spacing w:before="120" w:after="120"/>
-      </w:pPr>
-      <w:r>
-        <w:rPr>
-          <w:rFonts w:ascii="Arial" w:cs="Arial" w:eastAsia="Arial" w:hAnsi="Arial"/>
-          <w:color w:val="000000"/>
-          <w:sz w:val="20"/>
-          <w:szCs w:val="20"/>
-        </w:rPr>
-        <w:t xml:space="preserve">We will contact you prior to 30 June each year to obtain the information required to prepare the distribution resolution. It is your responsibility to respond promptly and to execute the resolution document before 30 June.</w:t>
-      </w:r>
-    </w:p>
-    <w:p>
-      <w:pPr>
-        <w:spacing w:before="120" w:after="120"/>
-      </w:pPr>
-      <w:r>
-        <w:rPr>
-          <w:rFonts w:ascii="Arial" w:cs="Arial" w:eastAsia="Arial" w:hAnsi="Arial"/>
-          <w:color w:val="000000"/>
-          <w:sz w:val="20"/>
-          <w:szCs w:val="20"/>
-        </w:rPr>
-        <w:t xml:space="preserve">We will also consider potential Section 100A risks in the context of trust distributions and advise you where we identify circumstances that may require further consideration.</w:t>
-      </w:r>
-    </w:p>
-    <w:p>
-      <w:pPr>
-        <w:spacing w:before="80" w:after="80"/>
-      </w:pPr>
-      <w:r>
-        <w:rPr>
-          <w:rFonts w:ascii="Courier New" w:cs="Courier New" w:eastAsia="Courier New" w:hAnsi="Courier New"/>
-          <w:color w:val="888888"/>
-          <w:sz w:val="16"/>
-          <w:szCs w:val="16"/>
-        </w:rPr>
-        <w:t xml:space="preserve">{% endif %}</w:t>
-      </w:r>
-    </w:p>
-    <w:p>
-      <w:pPr>
-        <w:pBdr>
-          <w:bottom w:val="single" w:color="000000" w:sz="6" w:space="3"/>
-        </w:pBdr>
-        <w:spacing w:before="280" w:after="120"/>
-      </w:pPr>
-      <w:r>
-        <w:rPr>
-          <w:rFonts w:ascii="Arial" w:cs="Arial" w:eastAsia="Arial" w:hAnsi="Arial"/>
-          <w:b/>
-          <w:bCs/>
-          <w:color w:val="000000"/>
-          <w:sz w:val="20"/>
-          <w:szCs w:val="20"/>
-        </w:rPr>
-        <w:t xml:space="preserve">{{ section_standards }}. PROFESSIONAL STANDARDS AND REGISTRATION</w:t>
-      </w:r>
-    </w:p>
-    <w:p>
-      <w:pPr>
-        <w:spacing w:before="120" w:after="120"/>
-      </w:pPr>
-      <w:r>
-        <w:rPr>
-          <w:rFonts w:ascii="Arial" w:cs="Arial" w:eastAsia="Arial" w:hAnsi="Arial"/>
-          <w:color w:val="000000"/>
-          <w:sz w:val="20"/>
-          <w:szCs w:val="20"/>
-        </w:rPr>
-        <w:t xml:space="preserve">{{ practice_name }} is a member of </w:t>
-      </w:r>
-      <w:r>
-        <w:rPr>
-          <w:rFonts w:ascii="Arial" w:cs="Arial" w:eastAsia="Arial" w:hAnsi="Arial"/>
-          <w:b/>
-          <w:bCs/>
-          <w:color w:val="000000"/>
-          <w:sz w:val="20"/>
-          <w:szCs w:val="20"/>
-        </w:rPr>
-        <w:t xml:space="preserve">{{ practice_professional_body }}</w:t>
-      </w:r>
-      <w:r>
-        <w:rPr>
-          <w:rFonts w:ascii="Arial" w:cs="Arial" w:eastAsia="Arial" w:hAnsi="Arial"/>
-          <w:color w:val="000000"/>
-          <w:sz w:val="20"/>
-          <w:szCs w:val="20"/>
-        </w:rPr>
-        <w:t xml:space="preserve"> and is bound by its professional standards, code of ethics, and continuing professional development requirements. All professional services are performed in accordance with these standards.</w:t>
-      </w:r>
-    </w:p>
-    <w:p>
-      <w:pPr>
-        <w:spacing w:before="120" w:after="120"/>
-      </w:pPr>
-      <w:r>
-        <w:rPr>
-          <w:rFonts w:ascii="Arial" w:cs="Arial" w:eastAsia="Arial" w:hAnsi="Arial"/>
-          <w:color w:val="000000"/>
-          <w:sz w:val="20"/>
-          <w:szCs w:val="20"/>
-        </w:rPr>
-        <w:t xml:space="preserve">{{ tpb_registration_statement }}</w:t>
-      </w:r>
-    </w:p>
-    <w:p>
-      <w:pPr>
-        <w:spacing w:before="120" w:after="120"/>
-      </w:pPr>
-      <w:r>
-        <w:rPr>
-          <w:rFonts w:ascii="Arial" w:cs="Arial" w:eastAsia="Arial" w:hAnsi="Arial"/>
-          <w:color w:val="000000"/>
-          <w:sz w:val="20"/>
-          <w:szCs w:val="20"/>
-        </w:rPr>
-        <w:t xml:space="preserve">{% if practice_bas_agent_number %}Where applicable, we are registered as a BAS Agent with the Tax Practitioners Board, registration number </w:t>
-      </w:r>
-      <w:r>
-        <w:rPr>
-          <w:rFonts w:ascii="Courier New" w:cs="Courier New" w:eastAsia="Courier New" w:hAnsi="Courier New"/>
-          <w:b/>
-          <w:bCs/>
-          <w:color w:val="000000"/>
-          <w:sz w:val="20"/>
-          <w:szCs w:val="20"/>
-        </w:rPr>
-        <w:t xml:space="preserve">{{ practice_bas_agent_number }}</w:t>
-      </w:r>
-      <w:r>
-        <w:rPr>
-          <w:rFonts w:ascii="Arial" w:cs="Arial" w:eastAsia="Arial" w:hAnsi="Arial"/>
-          <w:color w:val="000000"/>
-          <w:sz w:val="20"/>
-          <w:szCs w:val="20"/>
-        </w:rPr>
-        <w:t xml:space="preserve">.{% endif %}</w:t>
-      </w:r>
-    </w:p>
-    <w:p>
-      <w:pPr>
-        <w:pBdr>
-          <w:bottom w:val="single" w:color="000000" w:sz="6" w:space="3"/>
-        </w:pBdr>
-        <w:spacing w:before="280" w:after="120"/>
-      </w:pPr>
-      <w:r>
-        <w:rPr>
-          <w:rFonts w:ascii="Arial" w:cs="Arial" w:eastAsia="Arial" w:hAnsi="Arial"/>
-          <w:b/>
-          <w:bCs/>
-          <w:color w:val="000000"/>
-          <w:sz w:val="20"/>
-          <w:szCs w:val="20"/>
-        </w:rPr>
-        <w:t xml:space="preserve">{{ section_privacy }}. CONFIDENTIALITY, PRIVACY, AND DATA STORAGE</w:t>
-      </w:r>
-    </w:p>
-    <w:p>
-      <w:pPr>
-        <w:spacing w:before="120" w:after="120"/>
-      </w:pPr>
-      <w:r>
-        <w:rPr>
-          <w:rFonts w:ascii="Arial" w:cs="Arial" w:eastAsia="Arial" w:hAnsi="Arial"/>
-          <w:color w:val="000000"/>
-          <w:sz w:val="20"/>
-          <w:szCs w:val="20"/>
-        </w:rPr>
-        <w:t xml:space="preserve">We handle your personal and financial information in accordance with the </w:t>
-      </w:r>
-      <w:r>
-        <w:rPr>
-          <w:rFonts w:ascii="Arial" w:cs="Arial" w:eastAsia="Arial" w:hAnsi="Arial"/>
-          <w:b/>
-          <w:bCs/>
-          <w:color w:val="000000"/>
-          <w:sz w:val="20"/>
-          <w:szCs w:val="20"/>
-        </w:rPr>
-        <w:t xml:space="preserve">Privacy Act 1988 (Cth)</w:t>
-      </w:r>
-      <w:r>
-        <w:rPr>
-          <w:rFonts w:ascii="Arial" w:cs="Arial" w:eastAsia="Arial" w:hAnsi="Arial"/>
-          <w:color w:val="000000"/>
-          <w:sz w:val="20"/>
-          <w:szCs w:val="20"/>
-        </w:rPr>
-        <w:t xml:space="preserve"> and the Australian Privacy Principles (APPs). Our full Privacy Policy is available at </w:t>
-      </w:r>
-      <w:r>
-        <w:rPr>
-          <w:rFonts w:ascii="Courier New" w:cs="Courier New" w:eastAsia="Courier New" w:hAnsi="Courier New"/>
-          <w:b/>
-          <w:bCs/>
-          <w:color w:val="000000"/>
-          <w:sz w:val="20"/>
-          <w:szCs w:val="20"/>
-        </w:rPr>
-        <w:t xml:space="preserve">{{ practice_website }}</w:t>
-      </w:r>
-      <w:r>
-        <w:rPr>
-          <w:rFonts w:ascii="Arial" w:cs="Arial" w:eastAsia="Arial" w:hAnsi="Arial"/>
-          <w:color w:val="000000"/>
-          <w:sz w:val="20"/>
-          <w:szCs w:val="20"/>
-        </w:rPr>
-        <w:t xml:space="preserve">. By engaging us, you consent to the collection, use, and storage of your information as described in this section.</w:t>
-      </w:r>
-    </w:p>
-    <w:p>
-      <w:pPr>
-        <w:spacing w:before="120" w:after="120"/>
-      </w:pPr>
-      <w:r>
-        <w:rPr>
-          <w:rFonts w:ascii="Arial" w:cs="Arial" w:eastAsia="Arial" w:hAnsi="Arial"/>
-          <w:b/>
-          <w:bCs/>
-          <w:color w:val="000000"/>
-          <w:sz w:val="20"/>
-          <w:szCs w:val="20"/>
-        </w:rPr>
-        <w:t xml:space="preserve">Cloud-Based Practice Software.  </w:t>
-      </w:r>
-      <w:r>
-        <w:rPr>
-          <w:rFonts w:ascii="Arial" w:cs="Arial" w:eastAsia="Arial" w:hAnsi="Arial"/>
-          <w:color w:val="000000"/>
-          <w:sz w:val="20"/>
-          <w:szCs w:val="20"/>
-        </w:rPr>
-        <w:t xml:space="preserve">We use cloud-based practice management software to prepare, store, and manage your financial records, documents, correspondence, and tax data. This software is hosted on servers located in Australia. Your data is not sold, shared with third parties for commercial purposes, or used for any purpose other than providing the services described in this letter.</w:t>
-      </w:r>
-    </w:p>
-    <w:p>
-      <w:pPr>
-        <w:spacing w:before="120" w:after="120"/>
-      </w:pPr>
-      <w:r>
-        <w:rPr>
-          <w:rFonts w:ascii="Arial" w:cs="Arial" w:eastAsia="Arial" w:hAnsi="Arial"/>
-          <w:b/>
-          <w:bCs/>
-          <w:color w:val="000000"/>
-          <w:sz w:val="20"/>
-          <w:szCs w:val="20"/>
-        </w:rPr>
-        <w:t xml:space="preserve">Third-Party Service Providers.  </w:t>
-      </w:r>
-      <w:r>
-        <w:rPr>
-          <w:rFonts w:ascii="Arial" w:cs="Arial" w:eastAsia="Arial" w:hAnsi="Arial"/>
-          <w:color w:val="000000"/>
-          <w:sz w:val="20"/>
-          <w:szCs w:val="20"/>
-        </w:rPr>
-        <w:t xml:space="preserve">Where we engage third-party service providers to assist in delivering our services — including document signing platforms, accounting software integrations, and cloud infrastructure providers — those providers are bound by confidentiality obligations consistent with the Privacy Act 1988 (Cth). We will not share your information with third parties beyond what is strictly necessary to carry out your instructions.</w:t>
-      </w:r>
-    </w:p>
-    <w:p>
-      <w:pPr>
-        <w:spacing w:before="120" w:after="120"/>
-      </w:pPr>
-      <w:r>
-        <w:rPr>
-          <w:rFonts w:ascii="Arial" w:cs="Arial" w:eastAsia="Arial" w:hAnsi="Arial"/>
-          <w:b/>
-          <w:bCs/>
-          <w:color w:val="000000"/>
-          <w:sz w:val="20"/>
-          <w:szCs w:val="20"/>
-        </w:rPr>
-        <w:t xml:space="preserve">Regulatory Disclosure.  </w:t>
-      </w:r>
-      <w:r>
-        <w:rPr>
-          <w:rFonts w:ascii="Arial" w:cs="Arial" w:eastAsia="Arial" w:hAnsi="Arial"/>
-          <w:color w:val="000000"/>
-          <w:sz w:val="20"/>
-          <w:szCs w:val="20"/>
-        </w:rPr>
-        <w:t xml:space="preserve">We will disclose your information to the Australian Taxation Office, ASIC, state revenue authorities, and other regulatory bodies only where required by law or where necessary to carry out your instructions, such as lodging returns and statements on your behalf.</w:t>
-      </w:r>
-    </w:p>
-    <w:p>
-      <w:pPr>
-        <w:spacing w:before="80" w:after="80"/>
-      </w:pPr>
-      <w:r>
-        <w:rPr>
-          <w:rFonts w:ascii="Courier New" w:cs="Courier New" w:eastAsia="Courier New" w:hAnsi="Courier New"/>
-          <w:color w:val="888888"/>
-          <w:sz w:val="16"/>
-          <w:szCs w:val="16"/>
-        </w:rPr>
-        <w:t xml:space="preserve">{% if show_client_portal %}</w:t>
-      </w:r>
-    </w:p>
-    <w:p>
-      <w:pPr>
-        <w:spacing w:before="120" w:after="120"/>
-      </w:pPr>
-      <w:r>
-        <w:rPr>
-          <w:rFonts w:ascii="Arial" w:cs="Arial" w:eastAsia="Arial" w:hAnsi="Arial"/>
-          <w:b/>
-          <w:bCs/>
-          <w:color w:val="000000"/>
-          <w:sz w:val="20"/>
-          <w:szCs w:val="20"/>
-        </w:rPr>
-        <w:t xml:space="preserve">Client Portal.  </w:t>
-      </w:r>
-      <w:r>
-        <w:rPr>
-          <w:rFonts w:ascii="Arial" w:cs="Arial" w:eastAsia="Arial" w:hAnsi="Arial"/>
-          <w:color w:val="000000"/>
-          <w:sz w:val="20"/>
-          <w:szCs w:val="20"/>
-        </w:rPr>
-        <w:t xml:space="preserve">We provide access to a secure client portal at </w:t>
-      </w:r>
-      <w:r>
-        <w:rPr>
-          <w:rFonts w:ascii="Courier New" w:cs="Courier New" w:eastAsia="Courier New" w:hAnsi="Courier New"/>
-          <w:b/>
-          <w:bCs/>
-          <w:color w:val="000000"/>
-          <w:sz w:val="20"/>
-          <w:szCs w:val="20"/>
-        </w:rPr>
-        <w:t xml:space="preserve">{{ client_portal_url }}</w:t>
-      </w:r>
-      <w:r>
-        <w:rPr>
-          <w:rFonts w:ascii="Arial" w:cs="Arial" w:eastAsia="Arial" w:hAnsi="Arial"/>
-          <w:color w:val="000000"/>
-          <w:sz w:val="20"/>
-          <w:szCs w:val="20"/>
-        </w:rPr>
-        <w:t xml:space="preserve">. The portal allows you to view documents, approve financial statements, and communicate with our team securely. By accessing the portal, you accept the applicable terms of service for that platform. Access credentials will be provided to you separately.</w:t>
-      </w:r>
-    </w:p>
-    <w:p>
-      <w:pPr>
-        <w:spacing w:before="80" w:after="80"/>
-      </w:pPr>
-      <w:r>
-        <w:rPr>
-          <w:rFonts w:ascii="Courier New" w:cs="Courier New" w:eastAsia="Courier New" w:hAnsi="Courier New"/>
-          <w:color w:val="888888"/>
-          <w:sz w:val="16"/>
-          <w:szCs w:val="16"/>
-        </w:rPr>
-        <w:t xml:space="preserve">{% endif %}</w:t>
-      </w:r>
-    </w:p>
-    <w:p>
-      <w:pPr>
-        <w:spacing w:before="80" w:after="80"/>
-      </w:pPr>
-      <w:r>
-        <w:rPr>
-          <w:rFonts w:ascii="Courier New" w:cs="Courier New" w:eastAsia="Courier New" w:hAnsi="Courier New"/>
-          <w:color w:val="888888"/>
-          <w:sz w:val="16"/>
-          <w:szCs w:val="16"/>
-        </w:rPr>
-        <w:t xml:space="preserve">{% if show_fusesign %}</w:t>
-      </w:r>
-    </w:p>
-    <w:p>
-      <w:pPr>
-        <w:spacing w:before="120" w:after="120"/>
-      </w:pPr>
-      <w:r>
-        <w:rPr>
-          <w:rFonts w:ascii="Arial" w:cs="Arial" w:eastAsia="Arial" w:hAnsi="Arial"/>
-          <w:b/>
-          <w:bCs/>
-          <w:color w:val="000000"/>
-          <w:sz w:val="20"/>
-          <w:szCs w:val="20"/>
-        </w:rPr>
-        <w:t xml:space="preserve">Electronic Document Signing.  </w:t>
-      </w:r>
-      <w:r>
-        <w:rPr>
-          <w:rFonts w:ascii="Arial" w:cs="Arial" w:eastAsia="Arial" w:hAnsi="Arial"/>
-          <w:color w:val="000000"/>
-          <w:sz w:val="20"/>
-          <w:szCs w:val="20"/>
-        </w:rPr>
-        <w:t xml:space="preserve">We use an electronic document signing platform to send documents to you for execution. This platform processes your name, email address, and electronic signature for the sole purpose of executing documents relating to your engagement with us. By signing documents electronically, you accept the applicable terms of that platform. Electronic signatures applied through this service are legally binding under the </w:t>
-      </w:r>
-      <w:r>
-        <w:rPr>
-          <w:rFonts w:ascii="Arial" w:cs="Arial" w:eastAsia="Arial" w:hAnsi="Arial"/>
-          <w:b/>
-          <w:bCs/>
-          <w:color w:val="000000"/>
-          <w:sz w:val="20"/>
-          <w:szCs w:val="20"/>
-        </w:rPr>
-        <w:t xml:space="preserve">Electronic Transactions Act 1999 (Cth)</w:t>
-      </w:r>
-      <w:r>
-        <w:rPr>
-          <w:rFonts w:ascii="Arial" w:cs="Arial" w:eastAsia="Arial" w:hAnsi="Arial"/>
-          <w:color w:val="000000"/>
-          <w:sz w:val="20"/>
-          <w:szCs w:val="20"/>
-        </w:rPr>
-        <w:t xml:space="preserve">.</w:t>
-      </w:r>
-    </w:p>
-    <w:p>
-      <w:pPr>
-        <w:spacing w:before="80" w:after="80"/>
-      </w:pPr>
-      <w:r>
-        <w:rPr>
-          <w:rFonts w:ascii="Courier New" w:cs="Courier New" w:eastAsia="Courier New" w:hAnsi="Courier New"/>
-          <w:color w:val="888888"/>
-          <w:sz w:val="16"/>
-          <w:szCs w:val="16"/>
-        </w:rPr>
-        <w:t xml:space="preserve">{% endif %}</w:t>
-      </w:r>
-    </w:p>
-    <w:p>
-      <w:pPr>
-        <w:spacing w:before="120" w:after="120"/>
-      </w:pPr>
-      <w:r>
-        <w:rPr>
-          <w:rFonts w:ascii="Arial" w:cs="Arial" w:eastAsia="Arial" w:hAnsi="Arial"/>
-          <w:b/>
-          <w:bCs/>
-          <w:color w:val="000000"/>
-          <w:sz w:val="20"/>
-          <w:szCs w:val="20"/>
-        </w:rPr>
-        <w:t xml:space="preserve">Data Retention.  </w:t>
-      </w:r>
-      <w:r>
-        <w:rPr>
-          <w:rFonts w:ascii="Arial" w:cs="Arial" w:eastAsia="Arial" w:hAnsi="Arial"/>
-          <w:color w:val="000000"/>
-          <w:sz w:val="20"/>
-          <w:szCs w:val="20"/>
-        </w:rPr>
-        <w:t xml:space="preserve">We retain your financial records and documents for a minimum of seven years from the date of the relevant return, document, or transaction, in accordance with ATO record-keeping requirements and our obligations under the </w:t>
-      </w:r>
-      <w:r>
-        <w:rPr>
-          <w:rFonts w:ascii="Arial" w:cs="Arial" w:eastAsia="Arial" w:hAnsi="Arial"/>
-          <w:b/>
-          <w:bCs/>
-          <w:color w:val="000000"/>
-          <w:sz w:val="20"/>
-          <w:szCs w:val="20"/>
-        </w:rPr>
-        <w:t xml:space="preserve">Tax Agent Services Act 2009</w:t>
-      </w:r>
-      <w:r>
-        <w:rPr>
-          <w:rFonts w:ascii="Arial" w:cs="Arial" w:eastAsia="Arial" w:hAnsi="Arial"/>
-          <w:color w:val="000000"/>
-          <w:sz w:val="20"/>
-          <w:szCs w:val="20"/>
-        </w:rPr>
-        <w:t xml:space="preserve">. After this period, records may be securely destroyed unless you notify us in writing prior to that time that you wish to retain them.</w:t>
-      </w:r>
-    </w:p>
-    <w:p>
-      <w:pPr>
-        <w:spacing w:before="120" w:after="120"/>
-      </w:pPr>
-      <w:r>
-        <w:rPr>
-          <w:rFonts w:ascii="Arial" w:cs="Arial" w:eastAsia="Arial" w:hAnsi="Arial"/>
-          <w:b/>
-          <w:bCs/>
-          <w:color w:val="000000"/>
-          <w:sz w:val="20"/>
-          <w:szCs w:val="20"/>
-        </w:rPr>
-        <w:t xml:space="preserve">Access and Correction.  </w:t>
-      </w:r>
-      <w:r>
-        <w:rPr>
-          <w:rFonts w:ascii="Arial" w:cs="Arial" w:eastAsia="Arial" w:hAnsi="Arial"/>
-          <w:color w:val="000000"/>
-          <w:sz w:val="20"/>
-          <w:szCs w:val="20"/>
-        </w:rPr>
-        <w:t xml:space="preserve">You have the right to access the personal information we hold about you and to request corrections where that information is inaccurate, incomplete, or out of date. To make a request, contact us at </w:t>
-      </w:r>
-      <w:r>
-        <w:rPr>
-          <w:rFonts w:ascii="Courier New" w:cs="Courier New" w:eastAsia="Courier New" w:hAnsi="Courier New"/>
-          <w:b/>
-          <w:bCs/>
-          <w:color w:val="000000"/>
-          <w:sz w:val="20"/>
-          <w:szCs w:val="20"/>
-        </w:rPr>
-        <w:t xml:space="preserve">{{ practice_email }}</w:t>
-      </w:r>
-      <w:r>
-        <w:rPr>
-          <w:rFonts w:ascii="Arial" w:cs="Arial" w:eastAsia="Arial" w:hAnsi="Arial"/>
-          <w:color w:val="000000"/>
-          <w:sz w:val="20"/>
-          <w:szCs w:val="20"/>
-        </w:rPr>
-        <w:t xml:space="preserve">. We will respond within 30 days.</w:t>
-      </w:r>
-    </w:p>
-    <w:p>
-      <w:pPr>
-        <w:spacing w:before="120" w:after="120"/>
-      </w:pPr>
-      <w:r>
-        <w:rPr>
-          <w:rFonts w:ascii="Arial" w:cs="Arial" w:eastAsia="Arial" w:hAnsi="Arial"/>
-          <w:color w:val="000000"/>
-          <w:sz w:val="20"/>
-          <w:szCs w:val="20"/>
-        </w:rPr>
-        <w:t xml:space="preserve">If you do not wish us to use your information in a particular way, please advise us in writing. We will consider your request, noting that in some cases this may affect our ability to provide the services described in this letter.</w:t>
-      </w:r>
-    </w:p>
-    <w:p>
-      <w:pPr>
-        <w:pBdr>
-          <w:bottom w:val="single" w:color="000000" w:sz="6" w:space="3"/>
-        </w:pBdr>
-        <w:spacing w:before="280" w:after="120"/>
-      </w:pPr>
-      <w:r>
-        <w:rPr>
-          <w:rFonts w:ascii="Arial" w:cs="Arial" w:eastAsia="Arial" w:hAnsi="Arial"/>
-          <w:b/>
-          <w:bCs/>
-          <w:color w:val="000000"/>
-          <w:sz w:val="20"/>
-          <w:szCs w:val="20"/>
-        </w:rPr>
-        <w:t xml:space="preserve">{{ section_liability }}. LIMITATION OF LIABILITY</w:t>
-      </w:r>
-    </w:p>
-    <w:p>
-      <w:pPr>
-        <w:spacing w:before="120" w:after="120"/>
-      </w:pPr>
-      <w:r>
-        <w:rPr>
-          <w:rFonts w:ascii="Arial" w:cs="Arial" w:eastAsia="Arial" w:hAnsi="Arial"/>
-          <w:color w:val="000000"/>
-          <w:sz w:val="20"/>
-          <w:szCs w:val="20"/>
-        </w:rPr>
-        <w:t xml:space="preserve">Our liability to you arising out of or in connection with this engagement is limited to the fees paid by you to us for the specific services giving rise to the liability, or to the extent permitted by law, the maximum amount our professional indemnity insurance will cover in respect of that claim.</w:t>
-      </w:r>
-    </w:p>
-    <w:p>
-      <w:pPr>
-        <w:spacing w:before="120" w:after="120"/>
-      </w:pPr>
-      <w:r>
-        <w:rPr>
-          <w:rFonts w:ascii="Arial" w:cs="Arial" w:eastAsia="Arial" w:hAnsi="Arial"/>
-          <w:color w:val="000000"/>
-          <w:sz w:val="20"/>
-          <w:szCs w:val="20"/>
-        </w:rPr>
-        <w:t xml:space="preserve">We are not liable for any loss, damage, or expense arising from our reliance on information provided by you that was incomplete, inaccurate, or misleading. We are not liable for any indirect, consequential, special, or incidental loss or damage.</w:t>
-      </w:r>
-    </w:p>
-    <w:p>
-      <w:pPr>
-        <w:spacing w:before="120" w:after="120"/>
-      </w:pPr>
-      <w:r>
-        <w:rPr>
-          <w:rFonts w:ascii="Arial" w:cs="Arial" w:eastAsia="Arial" w:hAnsi="Arial"/>
-          <w:color w:val="000000"/>
-          <w:sz w:val="20"/>
-          <w:szCs w:val="20"/>
-        </w:rPr>
-        <w:t xml:space="preserve">Nothing in this clause limits our liability for fraud, wilful misconduct, or any liability that cannot be excluded by law.</w:t>
-      </w:r>
-    </w:p>
-    <w:p>
-      <w:pPr>
-        <w:pBdr>
-          <w:bottom w:val="single" w:color="000000" w:sz="6" w:space="3"/>
-        </w:pBdr>
-        <w:spacing w:before="280" w:after="120"/>
-      </w:pPr>
-      <w:r>
-        <w:rPr>
-          <w:rFonts w:ascii="Arial" w:cs="Arial" w:eastAsia="Arial" w:hAnsi="Arial"/>
-          <w:b/>
-          <w:bCs/>
-          <w:color w:val="000000"/>
-          <w:sz w:val="20"/>
-          <w:szCs w:val="20"/>
-        </w:rPr>
-        <w:t xml:space="preserve">{{ section_dispute }}. DISPUTE RESOLUTION</w:t>
-      </w:r>
-    </w:p>
-    <w:p>
-      <w:pPr>
-        <w:spacing w:before="120" w:after="120"/>
-      </w:pPr>
-      <w:r>
-        <w:rPr>
-          <w:rFonts w:ascii="Arial" w:cs="Arial" w:eastAsia="Arial" w:hAnsi="Arial"/>
-          <w:color w:val="000000"/>
-          <w:sz w:val="20"/>
-          <w:szCs w:val="20"/>
-        </w:rPr>
-        <w:t xml:space="preserve">If a dispute arises from this engagement, we ask that you first raise the matter directly with the partner responsible for your engagement so that we may attempt to resolve it. If we are unable to resolve the dispute, either party may refer the matter to the complaints process of </w:t>
-      </w:r>
-      <w:r>
-        <w:rPr>
-          <w:rFonts w:ascii="Arial" w:cs="Arial" w:eastAsia="Arial" w:hAnsi="Arial"/>
-          <w:b/>
-          <w:bCs/>
-          <w:color w:val="000000"/>
-          <w:sz w:val="20"/>
-          <w:szCs w:val="20"/>
-        </w:rPr>
-        <w:t xml:space="preserve">{{ practice_professional_body }}</w:t>
-      </w:r>
-      <w:r>
-        <w:rPr>
-          <w:rFonts w:ascii="Arial" w:cs="Arial" w:eastAsia="Arial" w:hAnsi="Arial"/>
-          <w:color w:val="000000"/>
-          <w:sz w:val="20"/>
-          <w:szCs w:val="20"/>
-        </w:rPr>
-        <w:t xml:space="preserve"> in accordance with their dispute resolution procedures.</w:t>
-      </w:r>
-    </w:p>
-    <w:p>
-      <w:pPr>
-        <w:spacing w:before="120" w:after="120"/>
-      </w:pPr>
-      <w:r>
-        <w:rPr>
-          <w:rFonts w:ascii="Arial" w:cs="Arial" w:eastAsia="Arial" w:hAnsi="Arial"/>
-          <w:color w:val="000000"/>
-          <w:sz w:val="20"/>
-          <w:szCs w:val="20"/>
-        </w:rPr>
-        <w:t xml:space="preserve">This engagement is governed by the laws of Victoria, Australia.</w:t>
-      </w:r>
-    </w:p>
-    <w:p>
-      <w:pPr>
-        <w:spacing w:before="80" w:after="80"/>
-      </w:pPr>
-      <w:r>
-        <w:rPr>
-          <w:rFonts w:ascii="Courier New" w:cs="Courier New" w:eastAsia="Courier New" w:hAnsi="Courier New"/>
-          <w:color w:val="888888"/>
-          <w:sz w:val="16"/>
-          <w:szCs w:val="16"/>
-        </w:rPr>
-        <w:t xml:space="preserve">{% if show_additional_terms %}</w:t>
-      </w:r>
-    </w:p>
-    <w:p>
-      <w:pPr>
-        <w:pBdr>
-          <w:bottom w:val="single" w:color="000000" w:sz="6" w:space="3"/>
-        </w:pBdr>
-        <w:spacing w:before="280" w:after="120"/>
-      </w:pPr>
-      <w:r>
-        <w:rPr>
-          <w:rFonts w:ascii="Arial" w:cs="Arial" w:eastAsia="Arial" w:hAnsi="Arial"/>
-          <w:b/>
-          <w:bCs/>
-          <w:color w:val="000000"/>
-          <w:sz w:val="20"/>
-          <w:szCs w:val="20"/>
-        </w:rPr>
-        <w:t xml:space="preserve">{{ section_additional }}. ADDITIONAL TERMS</w:t>
-      </w:r>
-    </w:p>
-    <w:p>
-      <w:pPr>
-        <w:spacing w:before="120" w:after="120"/>
-      </w:pPr>
-      <w:r>
-        <w:rPr>
-          <w:rFonts w:ascii="Courier New" w:cs="Courier New" w:eastAsia="Courier New" w:hAnsi="Courier New"/>
-          <w:b/>
-          <w:bCs/>
-          <w:color w:val="000000"/>
-          <w:sz w:val="20"/>
-          <w:szCs w:val="20"/>
-        </w:rPr>
-        <w:t xml:space="preserve">{{ additional_terms }}</w:t>
-      </w:r>
-    </w:p>
-    <w:p>
-      <w:pPr>
-        <w:spacing w:before="80" w:after="80"/>
-      </w:pPr>
-      <w:r>
-        <w:rPr>
-          <w:rFonts w:ascii="Courier New" w:cs="Courier New" w:eastAsia="Courier New" w:hAnsi="Courier New"/>
-          <w:color w:val="888888"/>
-          <w:sz w:val="16"/>
-          <w:szCs w:val="16"/>
-        </w:rPr>
-        <w:t xml:space="preserve">{% endif %}</w:t>
-      </w:r>
-    </w:p>
-    <w:p>
-      <w:pPr>
-        <w:pBdr>
-          <w:bottom w:val="single" w:color="000000" w:sz="6" w:space="3"/>
-        </w:pBdr>
-        <w:spacing w:before="280" w:after="120"/>
-      </w:pPr>
-      <w:r>
-        <w:rPr>
-          <w:rFonts w:ascii="Arial" w:cs="Arial" w:eastAsia="Arial" w:hAnsi="Arial"/>
-          <w:b/>
-          <w:bCs/>
-          <w:color w:val="000000"/>
-          <w:sz w:val="20"/>
-          <w:szCs w:val="20"/>
-        </w:rPr>
-        <w:t xml:space="preserve">{{ section_commencement }}. COMMENCEMENT</w:t>
-      </w:r>
-    </w:p>
-    <w:p>
-      <w:pPr>
-        <w:spacing w:before="120" w:after="120"/>
-      </w:pPr>
-      <w:r>
-        <w:rPr>
-          <w:rFonts w:ascii="Arial" w:cs="Arial" w:eastAsia="Arial" w:hAnsi="Arial"/>
-          <w:color w:val="000000"/>
-          <w:sz w:val="20"/>
-          <w:szCs w:val="20"/>
-        </w:rPr>
-        <w:t xml:space="preserve">This engagement letter takes effect from the date of acceptance below and continues until terminated by either party in writing, or until superseded by a new engagement letter.</w:t>
-      </w:r>
-    </w:p>
-    <w:p>
-      <w:pPr>
-        <w:spacing w:before="120" w:after="120"/>
-      </w:pPr>
-      <w:r>
-        <w:rPr>
-          <w:rFonts w:ascii="Arial" w:cs="Arial" w:eastAsia="Arial" w:hAnsi="Arial"/>
-          <w:color w:val="000000"/>
-          <w:sz w:val="20"/>
-          <w:szCs w:val="20"/>
-        </w:rPr>
-        <w:t xml:space="preserve">Either party may terminate this engagement by giving 30 days' written notice to the other party. We reserve the right to terminate this engagement immediately where fees remain unpaid or where you have not complied with your responsibilities as described in Section 3.</w:t>
-      </w:r>
-    </w:p>
-    <w:p>
-      <w:pPr>
-        <w:spacing w:before="120" w:after="120"/>
-        <w:jc w:val="center"/>
-      </w:pPr>
-      <w:r>
-        <w:rPr>
-          <w:rFonts w:ascii="Arial" w:cs="Arial" w:eastAsia="Arial" w:hAnsi="Arial"/>
-          <w:b/>
-          <w:bCs/>
-          <w:color w:val="000000"/>
-          <w:sz w:val="18"/>
-          <w:szCs w:val="18"/>
-        </w:rPr>
-        <w:t xml:space="preserve">{{ apes_305_reference }}</w:t>
       </w:r>
     </w:p>
     <w:p>
@@ -2419,6 +1633,873 @@
           <w:sz w:val="20"/>
           <w:szCs w:val="20"/>
         </w:rPr>
+        <w:t xml:space="preserve">{{ section_trust_dist }}. TRUST DISTRIBUTIONS — SPECIFIC TERMS</w:t>
+      </w:r>
+    </w:p>
+    <w:p>
+      <w:pPr>
+        <w:spacing w:before="120" w:after="120"/>
+      </w:pPr>
+      <w:r>
+        <w:rPr>
+          <w:rFonts w:ascii="Arial" w:cs="Arial" w:eastAsia="Arial" w:hAnsi="Arial"/>
+          <w:color w:val="000000"/>
+          <w:sz w:val="20"/>
+          <w:szCs w:val="20"/>
+        </w:rPr>
+        <w:t xml:space="preserve">For trust entities, trustee resolutions must be executed on or before 30 June each income year to be effective for that year. Failure to make a valid distribution resolution before this date may result in the ATO assessing the trustee on the entire net income of the trust at the top marginal tax rate.</w:t>
+      </w:r>
+    </w:p>
+    <w:p>
+      <w:pPr>
+        <w:spacing w:before="120" w:after="120"/>
+      </w:pPr>
+      <w:r>
+        <w:rPr>
+          <w:rFonts w:ascii="Arial" w:cs="Arial" w:eastAsia="Arial" w:hAnsi="Arial"/>
+          <w:color w:val="000000"/>
+          <w:sz w:val="20"/>
+          <w:szCs w:val="20"/>
+        </w:rPr>
+        <w:t xml:space="preserve">We will contact you prior to 30 June each year to obtain the information required to prepare the distribution resolution. It is your responsibility to respond promptly and to execute the resolution document before 30 June.</w:t>
+      </w:r>
+    </w:p>
+    <w:p>
+      <w:pPr>
+        <w:spacing w:before="120" w:after="120"/>
+      </w:pPr>
+      <w:r>
+        <w:rPr>
+          <w:rFonts w:ascii="Arial" w:cs="Arial" w:eastAsia="Arial" w:hAnsi="Arial"/>
+          <w:color w:val="000000"/>
+          <w:sz w:val="20"/>
+          <w:szCs w:val="20"/>
+        </w:rPr>
+        <w:t xml:space="preserve">We will also consider potential Section 100A risks in the context of trust distributions and advise you where we identify circumstances that may require further consideration.</w:t>
+      </w:r>
+    </w:p>
+    <w:p>
+      <w:pPr>
+        <w:spacing w:before="80" w:after="80"/>
+      </w:pPr>
+      <w:r>
+        <w:rPr>
+          <w:rFonts w:ascii="Courier New" w:cs="Courier New" w:eastAsia="Courier New" w:hAnsi="Courier New"/>
+          <w:color w:val="888888"/>
+          <w:sz w:val="16"/>
+          <w:szCs w:val="16"/>
+        </w:rPr>
+        <w:t xml:space="preserve">{% endif %}</w:t>
+      </w:r>
+    </w:p>
+    <w:p>
+      <w:pPr>
+        <w:pBdr>
+          <w:bottom w:val="single" w:color="000000" w:sz="6" w:space="3"/>
+        </w:pBdr>
+        <w:spacing w:before="240" w:after="80"/>
+      </w:pPr>
+      <w:r>
+        <w:rPr>
+          <w:rFonts w:ascii="Arial" w:cs="Arial" w:eastAsia="Arial" w:hAnsi="Arial"/>
+          <w:b/>
+          <w:bCs/>
+          <w:color w:val="000000"/>
+          <w:sz w:val="20"/>
+          <w:szCs w:val="20"/>
+        </w:rPr>
+        <w:t xml:space="preserve">{{ section_standards }}. PROFESSIONAL STANDARDS AND REGISTRATION</w:t>
+      </w:r>
+    </w:p>
+    <w:p>
+      <w:pPr>
+        <w:spacing w:before="120" w:after="120"/>
+      </w:pPr>
+      <w:r>
+        <w:rPr>
+          <w:rFonts w:ascii="Arial" w:cs="Arial" w:eastAsia="Arial" w:hAnsi="Arial"/>
+          <w:color w:val="000000"/>
+          <w:sz w:val="20"/>
+          <w:szCs w:val="20"/>
+        </w:rPr>
+        <w:t xml:space="preserve">{{ practice_name }} is a member of </w:t>
+      </w:r>
+      <w:r>
+        <w:rPr>
+          <w:rFonts w:ascii="Arial" w:cs="Arial" w:eastAsia="Arial" w:hAnsi="Arial"/>
+          <w:b/>
+          <w:bCs/>
+          <w:color w:val="000000"/>
+          <w:sz w:val="20"/>
+          <w:szCs w:val="20"/>
+        </w:rPr>
+        <w:t xml:space="preserve">{{ practice_professional_body }}</w:t>
+      </w:r>
+      <w:r>
+        <w:rPr>
+          <w:rFonts w:ascii="Arial" w:cs="Arial" w:eastAsia="Arial" w:hAnsi="Arial"/>
+          <w:color w:val="000000"/>
+          <w:sz w:val="20"/>
+          <w:szCs w:val="20"/>
+        </w:rPr>
+        <w:t xml:space="preserve"> and is bound by its professional standards, code of ethics, and continuing professional development requirements. All professional services are performed in accordance with these standards.</w:t>
+      </w:r>
+    </w:p>
+    <w:p>
+      <w:pPr>
+        <w:spacing w:before="120" w:after="120"/>
+      </w:pPr>
+      <w:r>
+        <w:rPr>
+          <w:rFonts w:ascii="Arial" w:cs="Arial" w:eastAsia="Arial" w:hAnsi="Arial"/>
+          <w:color w:val="000000"/>
+          <w:sz w:val="20"/>
+          <w:szCs w:val="20"/>
+        </w:rPr>
+        <w:t xml:space="preserve">{{ tpb_registration_statement }}</w:t>
+      </w:r>
+    </w:p>
+    <w:p>
+      <w:pPr>
+        <w:spacing w:before="120" w:after="120"/>
+      </w:pPr>
+      <w:r>
+        <w:rPr>
+          <w:rFonts w:ascii="Arial" w:cs="Arial" w:eastAsia="Arial" w:hAnsi="Arial"/>
+          <w:color w:val="000000"/>
+          <w:sz w:val="20"/>
+          <w:szCs w:val="20"/>
+        </w:rPr>
+        <w:t xml:space="preserve">{% if practice_bas_agent_number %}Where applicable, we are registered as a BAS Agent with the Tax Practitioners Board, registration number </w:t>
+      </w:r>
+      <w:r>
+        <w:rPr>
+          <w:rFonts w:ascii="Courier New" w:cs="Courier New" w:eastAsia="Courier New" w:hAnsi="Courier New"/>
+          <w:b/>
+          <w:bCs/>
+          <w:color w:val="000000"/>
+          <w:sz w:val="20"/>
+          <w:szCs w:val="20"/>
+        </w:rPr>
+        <w:t xml:space="preserve">{{ practice_bas_agent_number }}</w:t>
+      </w:r>
+      <w:r>
+        <w:rPr>
+          <w:rFonts w:ascii="Arial" w:cs="Arial" w:eastAsia="Arial" w:hAnsi="Arial"/>
+          <w:color w:val="000000"/>
+          <w:sz w:val="20"/>
+          <w:szCs w:val="20"/>
+        </w:rPr>
+        <w:t xml:space="preserve">.{% endif %}</w:t>
+      </w:r>
+    </w:p>
+    <w:p>
+      <w:pPr>
+        <w:pBdr>
+          <w:bottom w:val="single" w:color="000000" w:sz="6" w:space="3"/>
+        </w:pBdr>
+        <w:spacing w:before="240" w:after="80"/>
+      </w:pPr>
+      <w:r>
+        <w:rPr>
+          <w:rFonts w:ascii="Arial" w:cs="Arial" w:eastAsia="Arial" w:hAnsi="Arial"/>
+          <w:b/>
+          <w:bCs/>
+          <w:color w:val="000000"/>
+          <w:sz w:val="20"/>
+          <w:szCs w:val="20"/>
+        </w:rPr>
+        <w:t xml:space="preserve">{{ section_privacy }}. CONFIDENTIALITY, PRIVACY, AND DATA STORAGE</w:t>
+      </w:r>
+    </w:p>
+    <w:p>
+      <w:pPr>
+        <w:spacing w:before="120" w:after="120"/>
+      </w:pPr>
+      <w:r>
+        <w:rPr>
+          <w:rFonts w:ascii="Arial" w:cs="Arial" w:eastAsia="Arial" w:hAnsi="Arial"/>
+          <w:color w:val="000000"/>
+          <w:sz w:val="20"/>
+          <w:szCs w:val="20"/>
+        </w:rPr>
+        <w:t xml:space="preserve">We handle your personal and financial information in accordance with the </w:t>
+      </w:r>
+      <w:r>
+        <w:rPr>
+          <w:rFonts w:ascii="Arial" w:cs="Arial" w:eastAsia="Arial" w:hAnsi="Arial"/>
+          <w:b/>
+          <w:bCs/>
+          <w:color w:val="000000"/>
+          <w:sz w:val="20"/>
+          <w:szCs w:val="20"/>
+        </w:rPr>
+        <w:t xml:space="preserve">Privacy Act 1988 (Cth)</w:t>
+      </w:r>
+      <w:r>
+        <w:rPr>
+          <w:rFonts w:ascii="Arial" w:cs="Arial" w:eastAsia="Arial" w:hAnsi="Arial"/>
+          <w:color w:val="000000"/>
+          <w:sz w:val="20"/>
+          <w:szCs w:val="20"/>
+        </w:rPr>
+        <w:t xml:space="preserve"> and the Australian Privacy Principles (APPs). Our full Privacy Policy is available at </w:t>
+      </w:r>
+      <w:r>
+        <w:rPr>
+          <w:rFonts w:ascii="Courier New" w:cs="Courier New" w:eastAsia="Courier New" w:hAnsi="Courier New"/>
+          <w:b/>
+          <w:bCs/>
+          <w:color w:val="000000"/>
+          <w:sz w:val="20"/>
+          <w:szCs w:val="20"/>
+        </w:rPr>
+        <w:t xml:space="preserve">{{ practice_website }}</w:t>
+      </w:r>
+      <w:r>
+        <w:rPr>
+          <w:rFonts w:ascii="Arial" w:cs="Arial" w:eastAsia="Arial" w:hAnsi="Arial"/>
+          <w:color w:val="000000"/>
+          <w:sz w:val="20"/>
+          <w:szCs w:val="20"/>
+        </w:rPr>
+        <w:t xml:space="preserve">. By engaging us, you consent to the collection, use, and storage of your information as described in this section.</w:t>
+      </w:r>
+    </w:p>
+    <w:p>
+      <w:pPr>
+        <w:spacing w:before="120" w:after="120"/>
+      </w:pPr>
+      <w:r>
+        <w:rPr>
+          <w:rFonts w:ascii="Arial" w:cs="Arial" w:eastAsia="Arial" w:hAnsi="Arial"/>
+          <w:b/>
+          <w:bCs/>
+          <w:color w:val="000000"/>
+          <w:sz w:val="20"/>
+          <w:szCs w:val="20"/>
+        </w:rPr>
+        <w:t xml:space="preserve">Cloud-Based Practice Software.  </w:t>
+      </w:r>
+      <w:r>
+        <w:rPr>
+          <w:rFonts w:ascii="Arial" w:cs="Arial" w:eastAsia="Arial" w:hAnsi="Arial"/>
+          <w:color w:val="000000"/>
+          <w:sz w:val="20"/>
+          <w:szCs w:val="20"/>
+        </w:rPr>
+        <w:t xml:space="preserve">We use cloud-based practice management software to prepare, store, and manage your financial records, documents, correspondence, and tax data. This software is hosted on servers located in Australia. Your data is not sold, shared with third parties for commercial purposes, or used for any purpose other than providing the services described in this letter.</w:t>
+      </w:r>
+    </w:p>
+    <w:p>
+      <w:pPr>
+        <w:spacing w:before="120" w:after="120"/>
+      </w:pPr>
+      <w:r>
+        <w:rPr>
+          <w:rFonts w:ascii="Arial" w:cs="Arial" w:eastAsia="Arial" w:hAnsi="Arial"/>
+          <w:b/>
+          <w:bCs/>
+          <w:color w:val="000000"/>
+          <w:sz w:val="20"/>
+          <w:szCs w:val="20"/>
+        </w:rPr>
+        <w:t xml:space="preserve">Third-Party Service Providers.  </w:t>
+      </w:r>
+      <w:r>
+        <w:rPr>
+          <w:rFonts w:ascii="Arial" w:cs="Arial" w:eastAsia="Arial" w:hAnsi="Arial"/>
+          <w:color w:val="000000"/>
+          <w:sz w:val="20"/>
+          <w:szCs w:val="20"/>
+        </w:rPr>
+        <w:t xml:space="preserve">Where we engage third-party service providers to assist in delivering our services — including document signing platforms, accounting software integrations, and cloud infrastructure providers — those providers are bound by confidentiality obligations consistent with the Privacy Act 1988 (Cth). We will not share your information with third parties beyond what is strictly necessary to carry out your instructions.</w:t>
+      </w:r>
+    </w:p>
+    <w:p>
+      <w:pPr>
+        <w:spacing w:before="120" w:after="120"/>
+      </w:pPr>
+      <w:r>
+        <w:rPr>
+          <w:rFonts w:ascii="Arial" w:cs="Arial" w:eastAsia="Arial" w:hAnsi="Arial"/>
+          <w:b/>
+          <w:bCs/>
+          <w:color w:val="000000"/>
+          <w:sz w:val="20"/>
+          <w:szCs w:val="20"/>
+        </w:rPr>
+        <w:t xml:space="preserve">Regulatory Disclosure.  </w:t>
+      </w:r>
+      <w:r>
+        <w:rPr>
+          <w:rFonts w:ascii="Arial" w:cs="Arial" w:eastAsia="Arial" w:hAnsi="Arial"/>
+          <w:color w:val="000000"/>
+          <w:sz w:val="20"/>
+          <w:szCs w:val="20"/>
+        </w:rPr>
+        <w:t xml:space="preserve">We will disclose your information to the Australian Taxation Office, ASIC, state revenue authorities, and other regulatory bodies only where required by law or where necessary to carry out your instructions, such as lodging returns and statements on your behalf.</w:t>
+      </w:r>
+    </w:p>
+    <w:p>
+      <w:pPr>
+        <w:spacing w:before="80" w:after="80"/>
+      </w:pPr>
+      <w:r>
+        <w:rPr>
+          <w:rFonts w:ascii="Courier New" w:cs="Courier New" w:eastAsia="Courier New" w:hAnsi="Courier New"/>
+          <w:color w:val="888888"/>
+          <w:sz w:val="16"/>
+          <w:szCs w:val="16"/>
+        </w:rPr>
+        <w:t xml:space="preserve">{% if show_client_portal %}</w:t>
+      </w:r>
+    </w:p>
+    <w:p>
+      <w:pPr>
+        <w:spacing w:before="120" w:after="120"/>
+      </w:pPr>
+      <w:r>
+        <w:rPr>
+          <w:rFonts w:ascii="Arial" w:cs="Arial" w:eastAsia="Arial" w:hAnsi="Arial"/>
+          <w:b/>
+          <w:bCs/>
+          <w:color w:val="000000"/>
+          <w:sz w:val="20"/>
+          <w:szCs w:val="20"/>
+        </w:rPr>
+        <w:t xml:space="preserve">Client Portal.  </w:t>
+      </w:r>
+      <w:r>
+        <w:rPr>
+          <w:rFonts w:ascii="Arial" w:cs="Arial" w:eastAsia="Arial" w:hAnsi="Arial"/>
+          <w:color w:val="000000"/>
+          <w:sz w:val="20"/>
+          <w:szCs w:val="20"/>
+        </w:rPr>
+        <w:t xml:space="preserve">We provide access to a secure client portal at </w:t>
+      </w:r>
+      <w:r>
+        <w:rPr>
+          <w:rFonts w:ascii="Courier New" w:cs="Courier New" w:eastAsia="Courier New" w:hAnsi="Courier New"/>
+          <w:b/>
+          <w:bCs/>
+          <w:color w:val="000000"/>
+          <w:sz w:val="20"/>
+          <w:szCs w:val="20"/>
+        </w:rPr>
+        <w:t xml:space="preserve">{{ client_portal_url }}</w:t>
+      </w:r>
+      <w:r>
+        <w:rPr>
+          <w:rFonts w:ascii="Arial" w:cs="Arial" w:eastAsia="Arial" w:hAnsi="Arial"/>
+          <w:color w:val="000000"/>
+          <w:sz w:val="20"/>
+          <w:szCs w:val="20"/>
+        </w:rPr>
+        <w:t xml:space="preserve">. The portal allows you to view documents, approve financial statements, and communicate with our team securely. By accessing the portal, you accept the applicable terms of service for that platform. Access credentials will be provided to you separately.</w:t>
+      </w:r>
+    </w:p>
+    <w:p>
+      <w:pPr>
+        <w:spacing w:before="80" w:after="80"/>
+      </w:pPr>
+      <w:r>
+        <w:rPr>
+          <w:rFonts w:ascii="Courier New" w:cs="Courier New" w:eastAsia="Courier New" w:hAnsi="Courier New"/>
+          <w:color w:val="888888"/>
+          <w:sz w:val="16"/>
+          <w:szCs w:val="16"/>
+        </w:rPr>
+        <w:t xml:space="preserve">{% endif %}</w:t>
+      </w:r>
+    </w:p>
+    <w:p>
+      <w:pPr>
+        <w:spacing w:before="80" w:after="80"/>
+      </w:pPr>
+      <w:r>
+        <w:rPr>
+          <w:rFonts w:ascii="Courier New" w:cs="Courier New" w:eastAsia="Courier New" w:hAnsi="Courier New"/>
+          <w:color w:val="888888"/>
+          <w:sz w:val="16"/>
+          <w:szCs w:val="16"/>
+        </w:rPr>
+        <w:t xml:space="preserve">{% if show_fusesign %}</w:t>
+      </w:r>
+    </w:p>
+    <w:p>
+      <w:pPr>
+        <w:spacing w:before="120" w:after="120"/>
+      </w:pPr>
+      <w:r>
+        <w:rPr>
+          <w:rFonts w:ascii="Arial" w:cs="Arial" w:eastAsia="Arial" w:hAnsi="Arial"/>
+          <w:b/>
+          <w:bCs/>
+          <w:color w:val="000000"/>
+          <w:sz w:val="20"/>
+          <w:szCs w:val="20"/>
+        </w:rPr>
+        <w:t xml:space="preserve">Electronic Document Signing.  </w:t>
+      </w:r>
+      <w:r>
+        <w:rPr>
+          <w:rFonts w:ascii="Arial" w:cs="Arial" w:eastAsia="Arial" w:hAnsi="Arial"/>
+          <w:color w:val="000000"/>
+          <w:sz w:val="20"/>
+          <w:szCs w:val="20"/>
+        </w:rPr>
+        <w:t xml:space="preserve">We use an electronic document signing platform to send documents to you for execution. This platform processes your name, email address, and electronic signature for the sole purpose of executing documents relating to your engagement with us. By signing documents electronically, you accept the applicable terms of that platform. Electronic signatures applied through this service are legally binding under the </w:t>
+      </w:r>
+      <w:r>
+        <w:rPr>
+          <w:rFonts w:ascii="Arial" w:cs="Arial" w:eastAsia="Arial" w:hAnsi="Arial"/>
+          <w:b/>
+          <w:bCs/>
+          <w:color w:val="000000"/>
+          <w:sz w:val="20"/>
+          <w:szCs w:val="20"/>
+        </w:rPr>
+        <w:t xml:space="preserve">Electronic Transactions Act 1999 (Cth)</w:t>
+      </w:r>
+      <w:r>
+        <w:rPr>
+          <w:rFonts w:ascii="Arial" w:cs="Arial" w:eastAsia="Arial" w:hAnsi="Arial"/>
+          <w:color w:val="000000"/>
+          <w:sz w:val="20"/>
+          <w:szCs w:val="20"/>
+        </w:rPr>
+        <w:t xml:space="preserve">.</w:t>
+      </w:r>
+    </w:p>
+    <w:p>
+      <w:pPr>
+        <w:spacing w:before="80" w:after="80"/>
+      </w:pPr>
+      <w:r>
+        <w:rPr>
+          <w:rFonts w:ascii="Courier New" w:cs="Courier New" w:eastAsia="Courier New" w:hAnsi="Courier New"/>
+          <w:color w:val="888888"/>
+          <w:sz w:val="16"/>
+          <w:szCs w:val="16"/>
+        </w:rPr>
+        <w:t xml:space="preserve">{% endif %}</w:t>
+      </w:r>
+    </w:p>
+    <w:p>
+      <w:pPr>
+        <w:spacing w:before="120" w:after="120"/>
+      </w:pPr>
+      <w:r>
+        <w:rPr>
+          <w:rFonts w:ascii="Arial" w:cs="Arial" w:eastAsia="Arial" w:hAnsi="Arial"/>
+          <w:b/>
+          <w:bCs/>
+          <w:color w:val="000000"/>
+          <w:sz w:val="20"/>
+          <w:szCs w:val="20"/>
+        </w:rPr>
+        <w:t xml:space="preserve">Data Retention.  </w:t>
+      </w:r>
+      <w:r>
+        <w:rPr>
+          <w:rFonts w:ascii="Arial" w:cs="Arial" w:eastAsia="Arial" w:hAnsi="Arial"/>
+          <w:color w:val="000000"/>
+          <w:sz w:val="20"/>
+          <w:szCs w:val="20"/>
+        </w:rPr>
+        <w:t xml:space="preserve">We retain your financial records and documents for a minimum of seven years from the date of the relevant return, document, or transaction, in accordance with ATO record-keeping requirements and our obligations under the </w:t>
+      </w:r>
+      <w:r>
+        <w:rPr>
+          <w:rFonts w:ascii="Arial" w:cs="Arial" w:eastAsia="Arial" w:hAnsi="Arial"/>
+          <w:b/>
+          <w:bCs/>
+          <w:color w:val="000000"/>
+          <w:sz w:val="20"/>
+          <w:szCs w:val="20"/>
+        </w:rPr>
+        <w:t xml:space="preserve">Tax Agent Services Act 2009</w:t>
+      </w:r>
+      <w:r>
+        <w:rPr>
+          <w:rFonts w:ascii="Arial" w:cs="Arial" w:eastAsia="Arial" w:hAnsi="Arial"/>
+          <w:color w:val="000000"/>
+          <w:sz w:val="20"/>
+          <w:szCs w:val="20"/>
+        </w:rPr>
+        <w:t xml:space="preserve">. After this period, records may be securely destroyed unless you notify us in writing prior to that time that you wish to retain them.</w:t>
+      </w:r>
+    </w:p>
+    <w:p>
+      <w:pPr>
+        <w:spacing w:before="120" w:after="120"/>
+      </w:pPr>
+      <w:r>
+        <w:rPr>
+          <w:rFonts w:ascii="Arial" w:cs="Arial" w:eastAsia="Arial" w:hAnsi="Arial"/>
+          <w:b/>
+          <w:bCs/>
+          <w:color w:val="000000"/>
+          <w:sz w:val="20"/>
+          <w:szCs w:val="20"/>
+        </w:rPr>
+        <w:t xml:space="preserve">Access and Correction.  </w:t>
+      </w:r>
+      <w:r>
+        <w:rPr>
+          <w:rFonts w:ascii="Arial" w:cs="Arial" w:eastAsia="Arial" w:hAnsi="Arial"/>
+          <w:color w:val="000000"/>
+          <w:sz w:val="20"/>
+          <w:szCs w:val="20"/>
+        </w:rPr>
+        <w:t xml:space="preserve">You have the right to access the personal information we hold about you and to request corrections where that information is inaccurate, incomplete, or out of date. To make a request, contact us at </w:t>
+      </w:r>
+      <w:r>
+        <w:rPr>
+          <w:rFonts w:ascii="Courier New" w:cs="Courier New" w:eastAsia="Courier New" w:hAnsi="Courier New"/>
+          <w:b/>
+          <w:bCs/>
+          <w:color w:val="000000"/>
+          <w:sz w:val="20"/>
+          <w:szCs w:val="20"/>
+        </w:rPr>
+        <w:t xml:space="preserve">{{ practice_email }}</w:t>
+      </w:r>
+      <w:r>
+        <w:rPr>
+          <w:rFonts w:ascii="Arial" w:cs="Arial" w:eastAsia="Arial" w:hAnsi="Arial"/>
+          <w:color w:val="000000"/>
+          <w:sz w:val="20"/>
+          <w:szCs w:val="20"/>
+        </w:rPr>
+        <w:t xml:space="preserve">. We will respond within 30 days.</w:t>
+      </w:r>
+    </w:p>
+    <w:p>
+      <w:pPr>
+        <w:spacing w:before="120" w:after="120"/>
+      </w:pPr>
+      <w:r>
+        <w:rPr>
+          <w:rFonts w:ascii="Arial" w:cs="Arial" w:eastAsia="Arial" w:hAnsi="Arial"/>
+          <w:color w:val="000000"/>
+          <w:sz w:val="20"/>
+          <w:szCs w:val="20"/>
+        </w:rPr>
+        <w:t xml:space="preserve">If you do not wish us to use your information in a particular way, please advise us in writing. We will consider your request, noting that in some cases this may affect our ability to provide the services described in this letter.</w:t>
+      </w:r>
+    </w:p>
+    <w:p>
+      <w:pPr>
+        <w:pBdr>
+          <w:bottom w:val="single" w:color="000000" w:sz="6" w:space="3"/>
+        </w:pBdr>
+        <w:spacing w:before="240" w:after="80"/>
+      </w:pPr>
+      <w:r>
+        <w:rPr>
+          <w:rFonts w:ascii="Arial" w:cs="Arial" w:eastAsia="Arial" w:hAnsi="Arial"/>
+          <w:b/>
+          <w:bCs/>
+          <w:color w:val="000000"/>
+          <w:sz w:val="20"/>
+          <w:szCs w:val="20"/>
+        </w:rPr>
+        <w:t xml:space="preserve">{{ section_liability }}. LIMITATION OF LIABILITY</w:t>
+      </w:r>
+    </w:p>
+    <w:p>
+      <w:pPr>
+        <w:spacing w:before="120" w:after="120"/>
+      </w:pPr>
+      <w:r>
+        <w:rPr>
+          <w:rFonts w:ascii="Arial" w:cs="Arial" w:eastAsia="Arial" w:hAnsi="Arial"/>
+          <w:color w:val="000000"/>
+          <w:sz w:val="20"/>
+          <w:szCs w:val="20"/>
+        </w:rPr>
+        <w:t xml:space="preserve">Our liability to you arising out of or in connection with this engagement is limited to the fees paid by you to us for the specific services giving rise to the liability, or to the extent permitted by law, the maximum amount our professional indemnity insurance will cover in respect of that claim.</w:t>
+      </w:r>
+    </w:p>
+    <w:p>
+      <w:pPr>
+        <w:spacing w:before="120" w:after="120"/>
+      </w:pPr>
+      <w:r>
+        <w:rPr>
+          <w:rFonts w:ascii="Arial" w:cs="Arial" w:eastAsia="Arial" w:hAnsi="Arial"/>
+          <w:color w:val="000000"/>
+          <w:sz w:val="20"/>
+          <w:szCs w:val="20"/>
+        </w:rPr>
+        <w:t xml:space="preserve">We are not liable for any loss, damage, or expense arising from our reliance on information provided by you that was incomplete, inaccurate, or misleading. We are not liable for any indirect, consequential, special, or incidental loss or damage.</w:t>
+      </w:r>
+    </w:p>
+    <w:p>
+      <w:pPr>
+        <w:spacing w:before="120" w:after="120"/>
+      </w:pPr>
+      <w:r>
+        <w:rPr>
+          <w:rFonts w:ascii="Arial" w:cs="Arial" w:eastAsia="Arial" w:hAnsi="Arial"/>
+          <w:color w:val="000000"/>
+          <w:sz w:val="20"/>
+          <w:szCs w:val="20"/>
+        </w:rPr>
+        <w:t xml:space="preserve">Nothing in this clause limits our liability for fraud, wilful misconduct, or any liability that cannot be excluded by law.</w:t>
+      </w:r>
+    </w:p>
+    <w:p>
+      <w:pPr>
+        <w:pBdr>
+          <w:bottom w:val="single" w:color="000000" w:sz="6" w:space="3"/>
+        </w:pBdr>
+        <w:spacing w:before="240" w:after="80"/>
+      </w:pPr>
+      <w:r>
+        <w:rPr>
+          <w:rFonts w:ascii="Arial" w:cs="Arial" w:eastAsia="Arial" w:hAnsi="Arial"/>
+          <w:b/>
+          <w:bCs/>
+          <w:color w:val="000000"/>
+          <w:sz w:val="20"/>
+          <w:szCs w:val="20"/>
+        </w:rPr>
+        <w:t xml:space="preserve">{{ section_dispute }}. DISPUTE RESOLUTION</w:t>
+      </w:r>
+    </w:p>
+    <w:p>
+      <w:pPr>
+        <w:spacing w:before="120" w:after="120"/>
+      </w:pPr>
+      <w:r>
+        <w:rPr>
+          <w:rFonts w:ascii="Arial" w:cs="Arial" w:eastAsia="Arial" w:hAnsi="Arial"/>
+          <w:color w:val="000000"/>
+          <w:sz w:val="20"/>
+          <w:szCs w:val="20"/>
+        </w:rPr>
+        <w:t xml:space="preserve">If a dispute arises from this engagement, we ask that you first raise the matter directly with the partner responsible for your engagement so that we may attempt to resolve it. If we are unable to resolve the dispute, either party may refer the matter to the complaints process of </w:t>
+      </w:r>
+      <w:r>
+        <w:rPr>
+          <w:rFonts w:ascii="Arial" w:cs="Arial" w:eastAsia="Arial" w:hAnsi="Arial"/>
+          <w:b/>
+          <w:bCs/>
+          <w:color w:val="000000"/>
+          <w:sz w:val="20"/>
+          <w:szCs w:val="20"/>
+        </w:rPr>
+        <w:t xml:space="preserve">{{ practice_professional_body }}</w:t>
+      </w:r>
+      <w:r>
+        <w:rPr>
+          <w:rFonts w:ascii="Arial" w:cs="Arial" w:eastAsia="Arial" w:hAnsi="Arial"/>
+          <w:color w:val="000000"/>
+          <w:sz w:val="20"/>
+          <w:szCs w:val="20"/>
+        </w:rPr>
+        <w:t xml:space="preserve"> in accordance with their dispute resolution procedures.</w:t>
+      </w:r>
+    </w:p>
+    <w:p>
+      <w:pPr>
+        <w:spacing w:before="120" w:after="120"/>
+      </w:pPr>
+      <w:r>
+        <w:rPr>
+          <w:rFonts w:ascii="Arial" w:cs="Arial" w:eastAsia="Arial" w:hAnsi="Arial"/>
+          <w:color w:val="000000"/>
+          <w:sz w:val="20"/>
+          <w:szCs w:val="20"/>
+        </w:rPr>
+        <w:t xml:space="preserve">This engagement is governed by the laws of Victoria, Australia.</w:t>
+      </w:r>
+    </w:p>
+    <w:p>
+      <w:pPr>
+        <w:spacing w:before="80" w:after="80"/>
+      </w:pPr>
+      <w:r>
+        <w:rPr>
+          <w:rFonts w:ascii="Courier New" w:cs="Courier New" w:eastAsia="Courier New" w:hAnsi="Courier New"/>
+          <w:color w:val="888888"/>
+          <w:sz w:val="16"/>
+          <w:szCs w:val="16"/>
+        </w:rPr>
+        <w:t xml:space="preserve">{% if show_additional_terms %}</w:t>
+      </w:r>
+    </w:p>
+    <w:p>
+      <w:pPr>
+        <w:pBdr>
+          <w:bottom w:val="single" w:color="000000" w:sz="6" w:space="3"/>
+        </w:pBdr>
+        <w:spacing w:before="240" w:after="80"/>
+      </w:pPr>
+      <w:r>
+        <w:rPr>
+          <w:rFonts w:ascii="Arial" w:cs="Arial" w:eastAsia="Arial" w:hAnsi="Arial"/>
+          <w:b/>
+          <w:bCs/>
+          <w:color w:val="000000"/>
+          <w:sz w:val="20"/>
+          <w:szCs w:val="20"/>
+        </w:rPr>
+        <w:t xml:space="preserve">{{ section_additional }}. ADDITIONAL TERMS</w:t>
+      </w:r>
+    </w:p>
+    <w:p>
+      <w:pPr>
+        <w:spacing w:before="120" w:after="120"/>
+      </w:pPr>
+      <w:r>
+        <w:rPr>
+          <w:rFonts w:ascii="Courier New" w:cs="Courier New" w:eastAsia="Courier New" w:hAnsi="Courier New"/>
+          <w:b/>
+          <w:bCs/>
+          <w:color w:val="000000"/>
+          <w:sz w:val="20"/>
+          <w:szCs w:val="20"/>
+        </w:rPr>
+        <w:t xml:space="preserve">{{ additional_terms }}</w:t>
+      </w:r>
+    </w:p>
+    <w:p>
+      <w:pPr>
+        <w:spacing w:before="80" w:after="80"/>
+      </w:pPr>
+      <w:r>
+        <w:rPr>
+          <w:rFonts w:ascii="Courier New" w:cs="Courier New" w:eastAsia="Courier New" w:hAnsi="Courier New"/>
+          <w:color w:val="888888"/>
+          <w:sz w:val="16"/>
+          <w:szCs w:val="16"/>
+        </w:rPr>
+        <w:t xml:space="preserve">{% endif %}</w:t>
+      </w:r>
+    </w:p>
+    <w:p>
+      <w:pPr>
+        <w:pBdr>
+          <w:bottom w:val="single" w:color="000000" w:sz="6" w:space="3"/>
+        </w:pBdr>
+        <w:spacing w:before="240" w:after="80"/>
+      </w:pPr>
+      <w:r>
+        <w:rPr>
+          <w:rFonts w:ascii="Arial" w:cs="Arial" w:eastAsia="Arial" w:hAnsi="Arial"/>
+          <w:b/>
+          <w:bCs/>
+          <w:color w:val="000000"/>
+          <w:sz w:val="20"/>
+          <w:szCs w:val="20"/>
+        </w:rPr>
+        <w:t xml:space="preserve">{{ section_commencement }}. COMMENCEMENT</w:t>
+      </w:r>
+    </w:p>
+    <w:p>
+      <w:pPr>
+        <w:spacing w:before="120" w:after="120"/>
+      </w:pPr>
+      <w:r>
+        <w:rPr>
+          <w:rFonts w:ascii="Arial" w:cs="Arial" w:eastAsia="Arial" w:hAnsi="Arial"/>
+          <w:color w:val="000000"/>
+          <w:sz w:val="20"/>
+          <w:szCs w:val="20"/>
+        </w:rPr>
+        <w:t xml:space="preserve">This engagement letter takes effect from the date of acceptance below and continues until terminated by either party in writing, or until superseded by a new engagement letter.</w:t>
+      </w:r>
+    </w:p>
+    <w:p>
+      <w:pPr>
+        <w:spacing w:before="120" w:after="120"/>
+      </w:pPr>
+      <w:r>
+        <w:rPr>
+          <w:rFonts w:ascii="Arial" w:cs="Arial" w:eastAsia="Arial" w:hAnsi="Arial"/>
+          <w:color w:val="000000"/>
+          <w:sz w:val="20"/>
+          <w:szCs w:val="20"/>
+        </w:rPr>
+        <w:t xml:space="preserve">Either party may terminate this engagement by giving 30 days' written notice to the other party. We reserve the right to terminate this engagement immediately where fees remain unpaid or where you have not complied with your responsibilities as described in Section 3.</w:t>
+      </w:r>
+    </w:p>
+    <w:p>
+      <w:pPr>
+        <w:spacing w:before="0" w:after="0"/>
+      </w:pPr>
+      <w:r>
+        <w:t xml:space="preserve"/>
+      </w:r>
+    </w:p>
+    <w:p>
+      <w:pPr>
+        <w:pBdr>
+          <w:bottom w:val="single" w:color="999999" w:sz="4" w:space="1"/>
+        </w:pBdr>
+        <w:spacing w:before="140" w:after="140"/>
+      </w:pPr>
+      <w:r>
+        <w:t xml:space="preserve"/>
+      </w:r>
+    </w:p>
+    <w:p>
+      <w:pPr>
+        <w:spacing w:before="120" w:after="120"/>
+        <w:jc w:val="center"/>
+      </w:pPr>
+      <w:r>
+        <w:rPr>
+          <w:rFonts w:ascii="Arial" w:cs="Arial" w:eastAsia="Arial" w:hAnsi="Arial"/>
+          <w:b/>
+          <w:bCs/>
+          <w:color w:val="000000"/>
+          <w:sz w:val="18"/>
+          <w:szCs w:val="18"/>
+        </w:rPr>
+        <w:t xml:space="preserve">{{ apes_305_reference }}</w:t>
+      </w:r>
+    </w:p>
+    <w:p>
+      <w:pPr>
+        <w:pBdr>
+          <w:bottom w:val="single" w:color="999999" w:sz="4" w:space="1"/>
+        </w:pBdr>
+        <w:spacing w:before="140" w:after="140"/>
+      </w:pPr>
+      <w:r>
+        <w:t xml:space="preserve"/>
+      </w:r>
+    </w:p>
+    <w:p>
+      <w:pPr>
+        <w:spacing w:before="0" w:after="0"/>
+      </w:pPr>
+      <w:r>
+        <w:t xml:space="preserve"/>
+      </w:r>
+    </w:p>
+    <w:p>
+      <w:pPr>
+        <w:pBdr>
+          <w:bottom w:val="single" w:color="000000" w:sz="6" w:space="3"/>
+        </w:pBdr>
+        <w:spacing w:before="240" w:after="80"/>
+      </w:pPr>
+      <w:r>
+        <w:rPr>
+          <w:rFonts w:ascii="Arial" w:cs="Arial" w:eastAsia="Arial" w:hAnsi="Arial"/>
+          <w:b/>
+          <w:bCs/>
+          <w:color w:val="000000"/>
+          <w:sz w:val="20"/>
+          <w:szCs w:val="20"/>
+        </w:rPr>
         <w:t xml:space="preserve">ACCEPTANCE OF TERMS</w:t>
       </w:r>
     </w:p>
@@ -2448,6 +2529,14 @@
           <w:szCs w:val="20"/>
         </w:rPr>
         <w:t xml:space="preserve">You may return the signed letter by email, post, or via the electronic signature process if we have sent this letter through our secure document signing platform.</w:t>
+      </w:r>
+    </w:p>
+    <w:p>
+      <w:pPr>
+        <w:spacing w:before="0" w:after="0"/>
+      </w:pPr>
+      <w:r>
+        <w:t xml:space="preserve"/>
       </w:r>
     </w:p>
     <w:p>
@@ -2881,22 +2970,6 @@
     </w:p>
     <w:p>
       <w:pPr>
-        <w:spacing w:before="0" w:after="40"/>
-      </w:pPr>
-      <w:r>
-        <w:rPr>
-          <w:rFonts w:ascii="Courier New" w:cs="Courier New" w:eastAsia="Courier New" w:hAnsi="Courier New"/>
-          <w:b/>
-          <w:bCs/>
-          <w:color w:val="000000"/>
-          <w:sz w:val="20"/>
-          <w:szCs w:val="20"/>
-        </w:rPr>
-        <w:t xml:space="preserve">{% endfor %}</w:t>
-      </w:r>
-    </w:p>
-    <w:p>
-      <w:pPr>
         <w:spacing w:before="80" w:after="80"/>
       </w:pPr>
       <w:r>
@@ -3133,22 +3206,6 @@
     </w:p>
     <w:p>
       <w:pPr>
-        <w:spacing w:before="0" w:after="40"/>
-      </w:pPr>
-      <w:r>
-        <w:rPr>
-          <w:rFonts w:ascii="Courier New" w:cs="Courier New" w:eastAsia="Courier New" w:hAnsi="Courier New"/>
-          <w:b/>
-          <w:bCs/>
-          <w:color w:val="000000"/>
-          <w:sz w:val="20"/>
-          <w:szCs w:val="20"/>
-        </w:rPr>
-        <w:t xml:space="preserve">{% endfor %}</w:t>
-      </w:r>
-    </w:p>
-    <w:p>
-      <w:pPr>
         <w:spacing w:before="80" w:after="80"/>
       </w:pPr>
       <w:r>
@@ -3358,22 +3415,6 @@
     </w:p>
     <w:p>
       <w:pPr>
-        <w:spacing w:before="0" w:after="40"/>
-      </w:pPr>
-      <w:r>
-        <w:rPr>
-          <w:rFonts w:ascii="Courier New" w:cs="Courier New" w:eastAsia="Courier New" w:hAnsi="Courier New"/>
-          <w:b/>
-          <w:bCs/>
-          <w:color w:val="000000"/>
-          <w:sz w:val="20"/>
-          <w:szCs w:val="20"/>
-        </w:rPr>
-        <w:t xml:space="preserve">{% endfor %}</w:t>
-      </w:r>
-    </w:p>
-    <w:p>
-      <w:pPr>
         <w:spacing w:before="80" w:after="80"/>
       </w:pPr>
       <w:r>
@@ -3389,6 +3430,17 @@
     <w:p>
       <w:pPr>
         <w:spacing w:before="0" w:after="0"/>
+      </w:pPr>
+      <w:r>
+        <w:t xml:space="preserve"/>
+      </w:r>
+    </w:p>
+    <w:p>
+      <w:pPr>
+        <w:pBdr>
+          <w:bottom w:val="single" w:color="999999" w:sz="4" w:space="1"/>
+        </w:pBdr>
+        <w:spacing w:before="140" w:after="140"/>
       </w:pPr>
       <w:r>
         <w:t xml:space="preserve"/>

</xml_diff>

<commit_message>
fix: replace {% endif %} with {% endfor %} in signature block loops
Three {% for %} loops in the signature block (signing_directors,
trustees, partners) were incorrectly closed with {% endif %} instead
of {% endfor %}, causing template rendering errors.

After deploying, re-seed the template:
  python3 manage.py seed_engagement_letter_template \
    --file core/management/commands/Engagement_Letter_TEMPLATE_BW_v3.docx --force

Co-Authored-By: Claude Opus 4.6 (1M context) <noreply@anthropic.com>
</commit_message>
<xml_diff>
--- a/core/management/commands/Engagement_Letter_TEMPLATE_BW_v3.docx
+++ b/core/management/commands/Engagement_Letter_TEMPLATE_BW_v3.docx
@@ -2979,7 +2979,7 @@
           <w:sz w:val="16"/>
           <w:szCs w:val="16"/>
         </w:rPr>
-        <w:t xml:space="preserve">{% endif %}</w:t>
+        <w:t xml:space="preserve">{% endfor %}</w:t>
       </w:r>
     </w:p>
     <w:p>
@@ -3215,7 +3215,7 @@
           <w:sz w:val="16"/>
           <w:szCs w:val="16"/>
         </w:rPr>
-        <w:t xml:space="preserve">{% endif %}</w:t>
+        <w:t xml:space="preserve">{% endfor %}</w:t>
       </w:r>
     </w:p>
     <w:p>
@@ -3424,7 +3424,7 @@
           <w:sz w:val="16"/>
           <w:szCs w:val="16"/>
         </w:rPr>
-        <w:t xml:space="preserve">{% endif %}</w:t>
+        <w:t xml:space="preserve">{% endfor %}</w:t>
       </w:r>
     </w:p>
     <w:p>

</xml_diff>

<commit_message>
fix: audit and repair all for/endfor/if/endif mismatches in engagement letter template
Full Jinja2 tag audit revealed the actual issue was 3 missing {% endif %}
tags, not mismatched endfor. The signature block had:
  {% if is_company %} ... {% for director %} ... {% endfor %} [NO endif]
  {% if is_trust %} ... {% for trustee %} ... {% endfor %} [NO endif]
  {% if is_partnership %} ... {% for partner %} ... {% endfor %} [NO endif]

Added 3 {% endif %} paragraphs after each signature block's {% endfor %}.

Final audit: 38 tags, all balanced — 15 if/endif pairs, 4 for/endfor pairs.

After deploying, re-seed the template:
  python3 manage.py seed_engagement_letter_template \
    --file core/management/commands/Engagement_Letter_TEMPLATE_BW_v3.docx --force

Co-Authored-By: Claude Opus 4.6 (1M context) <noreply@anthropic.com>
</commit_message>
<xml_diff>
--- a/core/management/commands/Engagement_Letter_TEMPLATE_BW_v3.docx
+++ b/core/management/commands/Engagement_Letter_TEMPLATE_BW_v3.docx
@@ -2984,6 +2984,19 @@
     </w:p>
     <w:p>
       <w:pPr>
+        <w:spacing w:before="0" w:after="0"/>
+      </w:pPr>
+      <w:r>
+        <w:rPr>
+          <w:rFonts w:ascii="Arial" w:cs="Arial" w:eastAsia="Arial" w:hAnsi="Arial"/>
+          <w:sz w:val="20"/>
+          <w:szCs w:val="20"/>
+        </w:rPr>
+        <w:t>{% endif %}</w:t>
+      </w:r>
+    </w:p>
+    <w:p>
+      <w:pPr>
         <w:spacing w:before="80" w:after="80"/>
       </w:pPr>
       <w:r>
@@ -3220,6 +3233,19 @@
     </w:p>
     <w:p>
       <w:pPr>
+        <w:spacing w:before="0" w:after="0"/>
+      </w:pPr>
+      <w:r>
+        <w:rPr>
+          <w:rFonts w:ascii="Arial" w:cs="Arial" w:eastAsia="Arial" w:hAnsi="Arial"/>
+          <w:sz w:val="20"/>
+          <w:szCs w:val="20"/>
+        </w:rPr>
+        <w:t>{% endif %}</w:t>
+      </w:r>
+    </w:p>
+    <w:p>
+      <w:pPr>
         <w:spacing w:before="80" w:after="80"/>
       </w:pPr>
       <w:r>
@@ -3425,6 +3451,19 @@
           <w:szCs w:val="16"/>
         </w:rPr>
         <w:t xml:space="preserve">{% endfor %}</w:t>
+      </w:r>
+    </w:p>
+    <w:p>
+      <w:pPr>
+        <w:spacing w:before="0" w:after="0"/>
+      </w:pPr>
+      <w:r>
+        <w:rPr>
+          <w:rFonts w:ascii="Arial" w:cs="Arial" w:eastAsia="Arial" w:hAnsi="Arial"/>
+          <w:sz w:val="20"/>
+          <w:szCs w:val="20"/>
+        </w:rPr>
+        <w:t>{% endif %}</w:t>
       </w:r>
     </w:p>
     <w:p>

</xml_diff>